<commit_message>
CV: layout edits to the Word master (header, LSE roles order, Awards heading) and re-exported PDF
Co-Authored-By: Claude Sonnet 5.5 <noreply@anthropic.com>
</commit_message>
<xml_diff>
--- a/cv/Kenneth_Benoit_CV.docx
+++ b/cv/Kenneth_Benoit_CV.docx
@@ -168,14 +168,25 @@
               <w:rPr>
                 <w:rFonts w:ascii="Arial" w:hAnsi="Arial" w:cs="Arial"/>
               </w:rPr>
-              <w:t xml:space="preserve">Singapore Management University </w:t>
+              <w:t>Singapore Management University</w:t>
+            </w:r>
+            <w:r>
+              <w:rPr>
+                <w:rFonts w:ascii="Arial" w:hAnsi="Arial" w:cs="Arial"/>
+              </w:rPr>
+              <w:br/>
+            </w:r>
+            <w:r>
+              <w:rPr>
+                <w:rFonts w:ascii="Arial" w:hAnsi="Arial" w:cs="Arial"/>
+              </w:rPr>
+              <w:t xml:space="preserve">Singapore 179873 </w:t>
             </w:r>
           </w:p>
         </w:tc>
         <w:tc>
           <w:tcPr>
             <w:tcW w:w="4252" w:type="dxa"/>
-            <w:vAlign w:val="bottom"/>
           </w:tcPr>
           <w:p>
             <w:pPr>
@@ -222,39 +233,6 @@
               <w:t>: @kenbenoit</w:t>
             </w:r>
           </w:p>
-        </w:tc>
-      </w:tr>
-      <w:tr>
-        <w:trPr>
-          <w:trHeight w:val="215"/>
-        </w:trPr>
-        <w:tc>
-          <w:tcPr>
-            <w:tcW w:w="4962" w:type="dxa"/>
-            <w:vAlign w:val="bottom"/>
-          </w:tcPr>
-          <w:p>
-            <w:pPr>
-              <w:spacing w:after="0" w:line="259" w:lineRule="auto"/>
-              <w:ind w:left="0" w:firstLine="0"/>
-              <w:jc w:val="left"/>
-              <w:rPr>
-                <w:rFonts w:ascii="Arial" w:hAnsi="Arial" w:cs="Arial"/>
-              </w:rPr>
-            </w:pPr>
-            <w:r>
-              <w:rPr>
-                <w:rFonts w:ascii="Arial" w:hAnsi="Arial" w:cs="Arial"/>
-              </w:rPr>
-              <w:t>Singapore 179873</w:t>
-            </w:r>
-          </w:p>
-        </w:tc>
-        <w:tc>
-          <w:tcPr>
-            <w:tcW w:w="4252" w:type="dxa"/>
-            <w:vAlign w:val="bottom"/>
-          </w:tcPr>
           <w:p>
             <w:pPr>
               <w:spacing w:after="0" w:line="259" w:lineRule="auto"/>
@@ -276,24 +254,9 @@
               </w:r>
             </w:hyperlink>
             <w:r>
-              <w:rPr>
-                <w:rFonts w:ascii="Arial" w:hAnsi="Arial" w:cs="Arial"/>
-                <w:szCs w:val="22"/>
-              </w:rPr>
-              <w:t xml:space="preserve"> </w:t>
+              <w:t xml:space="preserve">  </w:t>
             </w:r>
-          </w:p>
-          <w:p>
-            <w:pPr>
-              <w:spacing w:after="0" w:line="259" w:lineRule="auto"/>
-              <w:ind w:left="0" w:firstLine="0"/>
-              <w:jc w:val="right"/>
-              <w:rPr>
-                <w:rFonts w:ascii="Arial" w:hAnsi="Arial" w:cs="Arial"/>
-                <w:szCs w:val="22"/>
-              </w:rPr>
-            </w:pPr>
-            <w:hyperlink r:id="rId99" w:history="1">
+            <w:hyperlink r:id="rId12" w:history="1">
               <w:r>
                 <w:rPr>
                   <w:rStyle w:val="Hyperlink"/>
@@ -303,6 +266,9 @@
                 <w:t>ORCID</w:t>
               </w:r>
             </w:hyperlink>
+            <w:r>
+              <w:t xml:space="preserve"> </w:t>
+            </w:r>
             <w:r>
               <w:rPr>
                 <w:rFonts w:ascii="Arial" w:hAnsi="Arial" w:cs="Arial"/>
@@ -316,7 +282,7 @@
     </w:tbl>
     <w:p>
       <w:pPr>
-        <w:spacing w:after="720" w:line="259" w:lineRule="auto"/>
+        <w:spacing w:after="640" w:line="259" w:lineRule="auto"/>
         <w:ind w:left="0" w:firstLine="0"/>
         <w:jc w:val="left"/>
         <w:rPr>
@@ -464,15 +430,12 @@
     <w:p>
       <w:pPr>
         <w:pStyle w:val="Heading1"/>
-        <w:rPr>
-          <w:rFonts w:ascii="Arial" w:hAnsi="Arial" w:cs="Arial"/>
-        </w:rPr>
-      </w:pPr>
-      <w:r>
-        <w:rPr>
-          <w:rFonts w:ascii="Arial" w:hAnsi="Arial" w:cs="Arial"/>
-        </w:rPr>
-        <w:t>Academic Positions</w:t>
+      </w:pPr>
+      <w:r>
+        <w:t xml:space="preserve">Academic </w:t>
+      </w:r>
+      <w:r>
+        <w:t>Positions</w:t>
       </w:r>
     </w:p>
     <w:p>
@@ -563,7 +526,7 @@
     </w:p>
     <w:p>
       <w:pPr>
-        <w:spacing w:after="583"/>
+        <w:spacing w:after="503"/>
         <w:ind w:left="11" w:right="591" w:firstLine="0"/>
         <w:rPr>
           <w:rFonts w:ascii="Arial" w:hAnsi="Arial" w:cs="Arial"/>
@@ -586,14 +549,9 @@
     <w:p>
       <w:pPr>
         <w:pStyle w:val="Heading1"/>
-        <w:rPr>
-          <w:rFonts w:ascii="Arial" w:hAnsi="Arial" w:cs="Arial"/>
-        </w:rPr>
-      </w:pPr>
-      <w:r>
-        <w:rPr>
-          <w:rFonts w:ascii="Arial" w:hAnsi="Arial" w:cs="Arial"/>
-        </w:rPr>
+        <w:spacing w:before="240"/>
+      </w:pPr>
+      <w:r>
         <w:t>Education</w:t>
       </w:r>
     </w:p>
@@ -667,12 +625,37 @@
           <w:rFonts w:ascii="Arial" w:hAnsi="Arial" w:cs="Arial"/>
         </w:rPr>
       </w:pPr>
+      <w:proofErr w:type="spellStart"/>
       <w:r>
         <w:rPr>
           <w:rFonts w:ascii="Arial" w:hAnsi="Arial" w:cs="Arial"/>
           <w:b/>
         </w:rPr>
-        <w:t>Institut d’Etudes Politiques de Paris</w:t>
+        <w:t>Institut</w:t>
+      </w:r>
+      <w:proofErr w:type="spellEnd"/>
+      <w:r>
+        <w:rPr>
+          <w:rFonts w:ascii="Arial" w:hAnsi="Arial" w:cs="Arial"/>
+          <w:b/>
+        </w:rPr>
+        <w:t xml:space="preserve"> </w:t>
+      </w:r>
+      <w:proofErr w:type="spellStart"/>
+      <w:r>
+        <w:rPr>
+          <w:rFonts w:ascii="Arial" w:hAnsi="Arial" w:cs="Arial"/>
+          <w:b/>
+        </w:rPr>
+        <w:t>d’Etudes</w:t>
+      </w:r>
+      <w:proofErr w:type="spellEnd"/>
+      <w:r>
+        <w:rPr>
+          <w:rFonts w:ascii="Arial" w:hAnsi="Arial" w:cs="Arial"/>
+          <w:b/>
+        </w:rPr>
+        <w:t xml:space="preserve"> Politiques de Paris</w:t>
       </w:r>
       <w:r>
         <w:rPr>
@@ -680,13 +663,41 @@
         </w:rPr>
         <w:t xml:space="preserve">, France. 1989–1990. Awarded the </w:t>
       </w:r>
+      <w:proofErr w:type="spellStart"/>
       <w:r>
         <w:rPr>
           <w:rFonts w:ascii="Arial" w:hAnsi="Arial" w:cs="Arial"/>
           <w:i/>
           <w:iCs/>
         </w:rPr>
-        <w:t>Certificat d’Etudes Politiques</w:t>
+        <w:t>Certificat</w:t>
+      </w:r>
+      <w:proofErr w:type="spellEnd"/>
+      <w:r>
+        <w:rPr>
+          <w:rFonts w:ascii="Arial" w:hAnsi="Arial" w:cs="Arial"/>
+          <w:i/>
+          <w:iCs/>
+        </w:rPr>
+        <w:t xml:space="preserve"> </w:t>
+      </w:r>
+      <w:proofErr w:type="spellStart"/>
+      <w:r>
+        <w:rPr>
+          <w:rFonts w:ascii="Arial" w:hAnsi="Arial" w:cs="Arial"/>
+          <w:i/>
+          <w:iCs/>
+        </w:rPr>
+        <w:t>d’Etudes</w:t>
+      </w:r>
+      <w:proofErr w:type="spellEnd"/>
+      <w:r>
+        <w:rPr>
+          <w:rFonts w:ascii="Arial" w:hAnsi="Arial" w:cs="Arial"/>
+          <w:i/>
+          <w:iCs/>
+        </w:rPr>
+        <w:t xml:space="preserve"> Politiques</w:t>
       </w:r>
       <w:r>
         <w:rPr>
@@ -697,7 +708,7 @@
     </w:p>
     <w:p>
       <w:pPr>
-        <w:spacing w:after="573"/>
+        <w:spacing w:after="493"/>
         <w:ind w:left="11" w:right="591" w:firstLine="0"/>
         <w:rPr>
           <w:rFonts w:ascii="Arial" w:hAnsi="Arial" w:cs="Arial"/>
@@ -733,14 +744,8 @@
     <w:p>
       <w:pPr>
         <w:pStyle w:val="Heading1"/>
-        <w:rPr>
-          <w:rFonts w:ascii="Arial" w:hAnsi="Arial" w:cs="Arial"/>
-        </w:rPr>
-      </w:pPr>
-      <w:r>
-        <w:rPr>
-          <w:rFonts w:ascii="Arial" w:hAnsi="Arial" w:cs="Arial"/>
-        </w:rPr>
+      </w:pPr>
+      <w:r>
         <w:t>Publications and Papers</w:t>
       </w:r>
     </w:p>
@@ -785,7 +790,7 @@
         </w:rPr>
         <w:t>Benoit, Kenneth and Michael Laver. "</w:t>
       </w:r>
-      <w:hyperlink r:id="rId12" w:history="1">
+      <w:hyperlink r:id="rId13" w:history="1">
         <w:r>
           <w:rPr>
             <w:rStyle w:val="Hyperlink"/>
@@ -832,7 +837,7 @@
         </w:rPr>
         <w:t xml:space="preserve"> </w:t>
       </w:r>
-      <w:hyperlink r:id="rId13" w:history="1">
+      <w:hyperlink r:id="rId14" w:history="1">
         <w:r>
           <w:rPr>
             <w:rStyle w:val="Hyperlink"/>
@@ -861,7 +866,21 @@
         <w:rPr>
           <w:rFonts w:ascii="Arial" w:hAnsi="Arial" w:cs="Arial"/>
         </w:rPr>
-        <w:t xml:space="preserve">. Benoit, Kenneth, Scott De Marchi, Conor Laver, Michael Laver, and Jinshuai Ma. </w:t>
+        <w:t xml:space="preserve">. Benoit, Kenneth, Scott De Marchi, Conor Laver, Michael Laver, and </w:t>
+      </w:r>
+      <w:proofErr w:type="spellStart"/>
+      <w:r>
+        <w:rPr>
+          <w:rFonts w:ascii="Arial" w:hAnsi="Arial" w:cs="Arial"/>
+        </w:rPr>
+        <w:t>Jinshuai</w:t>
+      </w:r>
+      <w:proofErr w:type="spellEnd"/>
+      <w:r>
+        <w:rPr>
+          <w:rFonts w:ascii="Arial" w:hAnsi="Arial" w:cs="Arial"/>
+        </w:rPr>
+        <w:t xml:space="preserve"> Ma. </w:t>
       </w:r>
       <w:r>
         <w:rPr>
@@ -869,13 +888,37 @@
         </w:rPr>
         <w:t>“</w:t>
       </w:r>
-      <w:hyperlink r:id="rId14" w:history="1">
+      <w:hyperlink r:id="rId15" w:history="1">
         <w:r>
           <w:rPr>
             <w:rStyle w:val="Hyperlink"/>
             <w:rFonts w:ascii="Arial" w:hAnsi="Arial" w:cs="Arial"/>
           </w:rPr>
-          <w:t>Using Large Language Models to Analyze Political Texts Through Natural Language Understanding</w:t>
+          <w:t xml:space="preserve">Using Large Language Models to </w:t>
+        </w:r>
+        <w:proofErr w:type="spellStart"/>
+        <w:r>
+          <w:rPr>
+            <w:rStyle w:val="Hyperlink"/>
+            <w:rFonts w:ascii="Arial" w:hAnsi="Arial" w:cs="Arial"/>
+          </w:rPr>
+          <w:t>Analyze</w:t>
+        </w:r>
+        <w:proofErr w:type="spellEnd"/>
+        <w:r>
+          <w:rPr>
+            <w:rStyle w:val="Hyperlink"/>
+            <w:rFonts w:ascii="Arial" w:hAnsi="Arial" w:cs="Arial"/>
+          </w:rPr>
+          <w:t xml:space="preserve"> Political Texts Through Natural Language </w:t>
+        </w:r>
+        <w:r>
+          <w:rPr>
+            <w:rStyle w:val="Hyperlink"/>
+            <w:rFonts w:ascii="Arial" w:hAnsi="Arial" w:cs="Arial"/>
+          </w:rPr>
+          <w:lastRenderedPageBreak/>
+          <w:t>Understanding</w:t>
         </w:r>
       </w:hyperlink>
       <w:r>
@@ -944,7 +987,7 @@
         </w:rPr>
         <w:t xml:space="preserve"> </w:t>
       </w:r>
-      <w:hyperlink r:id="rId15" w:tgtFrame="_blank" w:history="1">
+      <w:hyperlink r:id="rId16" w:tgtFrame="_blank" w:history="1">
         <w:r>
           <w:rPr>
             <w:rStyle w:val="Hyperlink"/>
@@ -965,10 +1008,9 @@
         <w:rPr>
           <w:rFonts w:ascii="Arial" w:hAnsi="Arial" w:cs="Arial"/>
         </w:rPr>
-        <w:lastRenderedPageBreak/>
         <w:t xml:space="preserve">2025. Benoit, Kenneth. </w:t>
       </w:r>
-      <w:hyperlink r:id="rId16" w:history="1">
+      <w:hyperlink r:id="rId17" w:history="1">
         <w:r>
           <w:rPr>
             <w:rFonts w:ascii="Arial" w:hAnsi="Arial" w:cs="Arial"/>
@@ -1037,7 +1079,7 @@
         </w:rPr>
         <w:t xml:space="preserve">. 3(3): 1–6. </w:t>
       </w:r>
-      <w:hyperlink r:id="rId17" w:history="1">
+      <w:hyperlink r:id="rId18" w:history="1">
         <w:r>
           <w:rPr>
             <w:rStyle w:val="Hyperlink"/>
@@ -1070,7 +1112,14 @@
         <w:rPr>
           <w:rFonts w:ascii="Arial" w:hAnsi="Arial" w:cs="Arial"/>
         </w:rPr>
-        <w:t>2022. D</w:t>
+        <w:t xml:space="preserve">2022. </w:t>
+      </w:r>
+      <w:proofErr w:type="spellStart"/>
+      <w:r>
+        <w:rPr>
+          <w:rFonts w:ascii="Arial" w:hAnsi="Arial" w:cs="Arial"/>
+        </w:rPr>
+        <w:t>D</w:t>
       </w:r>
       <w:r>
         <w:rPr>
@@ -1082,7 +1131,14 @@
         <w:rPr>
           <w:rFonts w:ascii="Arial" w:hAnsi="Arial" w:cs="Arial"/>
         </w:rPr>
-        <w:t xml:space="preserve">ubler, Thomas and Kenneth Benoit. “Scaling hand-coded political texts to learn more about left-right policy content.” </w:t>
+        <w:t>ubler</w:t>
+      </w:r>
+      <w:proofErr w:type="spellEnd"/>
+      <w:r>
+        <w:rPr>
+          <w:rFonts w:ascii="Arial" w:hAnsi="Arial" w:cs="Arial"/>
+        </w:rPr>
+        <w:t xml:space="preserve">, Thomas and Kenneth Benoit. “Scaling hand-coded political texts to learn more about left-right policy content.” </w:t>
       </w:r>
       <w:r>
         <w:rPr>
@@ -1097,7 +1153,7 @@
         </w:rPr>
         <w:t xml:space="preserve">. 28(5, September): </w:t>
       </w:r>
-      <w:hyperlink r:id="rId18" w:history="1">
+      <w:hyperlink r:id="rId19" w:history="1">
         <w:r>
           <w:rPr>
             <w:rStyle w:val="Hyperlink"/>
@@ -1118,7 +1174,21 @@
         <w:rPr>
           <w:rFonts w:ascii="Arial" w:hAnsi="Arial" w:cs="Arial"/>
         </w:rPr>
-        <w:t xml:space="preserve">2019. Benoit, Kenneth, Kevin Munger, and Arthur Spirling. “Measuring and Explaining Political Sophistication Through Textual Complexity.” </w:t>
+        <w:t xml:space="preserve">2019. Benoit, Kenneth, Kevin Munger, and Arthur </w:t>
+      </w:r>
+      <w:proofErr w:type="spellStart"/>
+      <w:r>
+        <w:rPr>
+          <w:rFonts w:ascii="Arial" w:hAnsi="Arial" w:cs="Arial"/>
+        </w:rPr>
+        <w:t>Spirling</w:t>
+      </w:r>
+      <w:proofErr w:type="spellEnd"/>
+      <w:r>
+        <w:rPr>
+          <w:rFonts w:ascii="Arial" w:hAnsi="Arial" w:cs="Arial"/>
+        </w:rPr>
+        <w:t xml:space="preserve">. “Measuring and Explaining Political Sophistication Through Textual Complexity.” </w:t>
       </w:r>
       <w:r>
         <w:rPr>
@@ -1133,7 +1203,7 @@
         </w:rPr>
         <w:t xml:space="preserve">63(2, April): </w:t>
       </w:r>
-      <w:hyperlink r:id="rId19" w:history="1">
+      <w:hyperlink r:id="rId20" w:history="1">
         <w:r>
           <w:rPr>
             <w:rStyle w:val="Hyperlink"/>
@@ -1172,7 +1242,35 @@
         <w:rPr>
           <w:rFonts w:ascii="Arial" w:hAnsi="Arial" w:cs="Arial"/>
         </w:rPr>
-        <w:t xml:space="preserve">ller, and Akitaka Matsuo. “quanteda: An R package for the quantitative analysis of textual data”. </w:t>
+        <w:t xml:space="preserve">ller, and </w:t>
+      </w:r>
+      <w:proofErr w:type="spellStart"/>
+      <w:r>
+        <w:rPr>
+          <w:rFonts w:ascii="Arial" w:hAnsi="Arial" w:cs="Arial"/>
+        </w:rPr>
+        <w:t>Akitaka</w:t>
+      </w:r>
+      <w:proofErr w:type="spellEnd"/>
+      <w:r>
+        <w:rPr>
+          <w:rFonts w:ascii="Arial" w:hAnsi="Arial" w:cs="Arial"/>
+        </w:rPr>
+        <w:t xml:space="preserve"> Matsuo. “</w:t>
+      </w:r>
+      <w:proofErr w:type="spellStart"/>
+      <w:r>
+        <w:rPr>
+          <w:rFonts w:ascii="Arial" w:hAnsi="Arial" w:cs="Arial"/>
+        </w:rPr>
+        <w:t>quanteda</w:t>
+      </w:r>
+      <w:proofErr w:type="spellEnd"/>
+      <w:r>
+        <w:rPr>
+          <w:rFonts w:ascii="Arial" w:hAnsi="Arial" w:cs="Arial"/>
+        </w:rPr>
+        <w:t xml:space="preserve">: An R package for the quantitative analysis of textual data”. </w:t>
       </w:r>
       <w:r>
         <w:rPr>
@@ -1187,7 +1285,7 @@
         </w:rPr>
         <w:t xml:space="preserve">. </w:t>
       </w:r>
-      <w:hyperlink r:id="rId20" w:history="1">
+      <w:hyperlink r:id="rId21" w:history="1">
         <w:r>
           <w:rPr>
             <w:rStyle w:val="Hyperlink"/>
@@ -1214,7 +1312,21 @@
         <w:rPr>
           <w:rFonts w:ascii="Arial" w:hAnsi="Arial" w:cs="Arial"/>
         </w:rPr>
-        <w:t xml:space="preserve">2018. Lincoln A. Mullen, Kenneth Benoit, Os Keyes, Dmitry Selivanov, and Jeffrey Arnold. “Fast, Consistent Tokenization of Natural Language Text.” </w:t>
+        <w:t xml:space="preserve">2018. Lincoln A. Mullen, Kenneth Benoit, </w:t>
+      </w:r>
+      <w:proofErr w:type="spellStart"/>
+      <w:r>
+        <w:rPr>
+          <w:rFonts w:ascii="Arial" w:hAnsi="Arial" w:cs="Arial"/>
+        </w:rPr>
+        <w:t>Os</w:t>
+      </w:r>
+      <w:proofErr w:type="spellEnd"/>
+      <w:r>
+        <w:rPr>
+          <w:rFonts w:ascii="Arial" w:hAnsi="Arial" w:cs="Arial"/>
+        </w:rPr>
+        <w:t xml:space="preserve"> Keyes, Dmitry Selivanov, and Jeffrey Arnold. “Fast, Consistent Tokenization of Natural Language Text.” </w:t>
       </w:r>
       <w:r>
         <w:rPr>
@@ -1229,7 +1341,7 @@
         </w:rPr>
         <w:t xml:space="preserve">3(23), </w:t>
       </w:r>
-      <w:hyperlink r:id="rId21" w:history="1">
+      <w:hyperlink r:id="rId22" w:history="1">
         <w:r>
           <w:rPr>
             <w:rStyle w:val="Hyperlink"/>
@@ -1251,7 +1363,21 @@
         <w:rPr>
           <w:rFonts w:ascii="Arial" w:hAnsi="Arial" w:cs="Arial"/>
         </w:rPr>
-        <w:t xml:space="preserve">2017. Amador Diaz Lopez, Julio Cesar, Sofia Collignon-Delmar, Kenneth Benoit, and Akitaka Matsuo. “Predicting the Brexit Vote by Tracking and Classifying Public Opinion Using Twitter Data.” </w:t>
+        <w:t xml:space="preserve">2017. Amador Diaz Lopez, Julio Cesar, Sofia Collignon-Delmar, Kenneth Benoit, and </w:t>
+      </w:r>
+      <w:proofErr w:type="spellStart"/>
+      <w:r>
+        <w:rPr>
+          <w:rFonts w:ascii="Arial" w:hAnsi="Arial" w:cs="Arial"/>
+        </w:rPr>
+        <w:t>Akitaka</w:t>
+      </w:r>
+      <w:proofErr w:type="spellEnd"/>
+      <w:r>
+        <w:rPr>
+          <w:rFonts w:ascii="Arial" w:hAnsi="Arial" w:cs="Arial"/>
+        </w:rPr>
+        <w:t xml:space="preserve"> Matsuo. “Predicting the Brexit Vote by Tracking and Classifying Public Opinion Using Twitter Data.” </w:t>
       </w:r>
       <w:r>
         <w:rPr>
@@ -1266,7 +1392,7 @@
         </w:rPr>
         <w:t xml:space="preserve">8(1): 85–104. </w:t>
       </w:r>
-      <w:hyperlink r:id="rId22" w:history="1">
+      <w:hyperlink r:id="rId23" w:history="1">
         <w:r>
           <w:rPr>
             <w:rStyle w:val="Hyperlink"/>
@@ -1287,7 +1413,21 @@
         <w:rPr>
           <w:rFonts w:ascii="Arial" w:hAnsi="Arial" w:cs="Arial"/>
         </w:rPr>
-        <w:t xml:space="preserve">2017. Welbers, Kasper, Wouter van Atteveldt, and Kenneth Benoit. “Text analysis in R.” </w:t>
+        <w:t xml:space="preserve">2017. </w:t>
+      </w:r>
+      <w:proofErr w:type="spellStart"/>
+      <w:r>
+        <w:rPr>
+          <w:rFonts w:ascii="Arial" w:hAnsi="Arial" w:cs="Arial"/>
+        </w:rPr>
+        <w:t>Welbers</w:t>
+      </w:r>
+      <w:proofErr w:type="spellEnd"/>
+      <w:r>
+        <w:rPr>
+          <w:rFonts w:ascii="Arial" w:hAnsi="Arial" w:cs="Arial"/>
+        </w:rPr>
+        <w:t xml:space="preserve">, Kasper, Wouter van Atteveldt, and Kenneth Benoit. “Text analysis in R.” </w:t>
       </w:r>
       <w:r>
         <w:rPr>
@@ -1302,7 +1442,7 @@
         </w:rPr>
         <w:t xml:space="preserve">. 11(4): 245–265. </w:t>
       </w:r>
-      <w:hyperlink r:id="rId23" w:history="1">
+      <w:hyperlink r:id="rId24" w:history="1">
         <w:r>
           <w:rPr>
             <w:rStyle w:val="Hyperlink"/>
@@ -1355,7 +1495,7 @@
         </w:rPr>
         <w:t xml:space="preserve">379–396. </w:t>
       </w:r>
-      <w:hyperlink r:id="rId24" w:history="1">
+      <w:hyperlink r:id="rId25" w:history="1">
         <w:r>
           <w:rPr>
             <w:rStyle w:val="Hyperlink"/>
@@ -1404,7 +1544,7 @@
         </w:rPr>
         <w:t xml:space="preserve"> </w:t>
       </w:r>
-      <w:hyperlink r:id="rId25" w:history="1">
+      <w:hyperlink r:id="rId26" w:history="1">
         <w:r>
           <w:rPr>
             <w:rStyle w:val="Hyperlink"/>
@@ -1452,7 +1592,7 @@
         </w:rPr>
         <w:t xml:space="preserve"> </w:t>
       </w:r>
-      <w:hyperlink r:id="rId26" w:history="1">
+      <w:hyperlink r:id="rId27" w:history="1">
         <w:r>
           <w:rPr>
             <w:rStyle w:val="Hyperlink"/>
@@ -1494,7 +1634,7 @@
         </w:rPr>
         <w:t xml:space="preserve"> </w:t>
       </w:r>
-      <w:hyperlink r:id="rId27" w:history="1">
+      <w:hyperlink r:id="rId28" w:history="1">
         <w:r>
           <w:rPr>
             <w:rStyle w:val="Hyperlink"/>
@@ -1536,7 +1676,7 @@
         </w:rPr>
         <w:t xml:space="preserve">. </w:t>
       </w:r>
-      <w:hyperlink r:id="rId28" w:history="1">
+      <w:hyperlink r:id="rId29" w:history="1">
         <w:r>
           <w:rPr>
             <w:rStyle w:val="Hyperlink"/>
@@ -1586,7 +1726,7 @@
         </w:rPr>
         <w:t xml:space="preserve"> </w:t>
       </w:r>
-      <w:hyperlink r:id="rId29" w:history="1">
+      <w:hyperlink r:id="rId30" w:history="1">
         <w:r>
           <w:rPr>
             <w:rStyle w:val="Hyperlink"/>
@@ -1607,7 +1747,15 @@
         <w:rPr>
           <w:rFonts w:ascii="Arial" w:hAnsi="Arial" w:cs="Arial"/>
         </w:rPr>
-        <w:t>2012. D</w:t>
+        <w:lastRenderedPageBreak/>
+        <w:t xml:space="preserve">2012. </w:t>
+      </w:r>
+      <w:proofErr w:type="spellStart"/>
+      <w:r>
+        <w:rPr>
+          <w:rFonts w:ascii="Arial" w:hAnsi="Arial" w:cs="Arial"/>
+        </w:rPr>
+        <w:t>D</w:t>
       </w:r>
       <w:r>
         <w:rPr>
@@ -1619,7 +1767,14 @@
         <w:rPr>
           <w:rFonts w:ascii="Arial" w:hAnsi="Arial" w:cs="Arial"/>
         </w:rPr>
-        <w:t xml:space="preserve">ubler, Thomas, Kenneth Benoit, Slava Mikhaylov, and Michael Laver. “Natural Sentences as Valid Units for Coded Political Texts.” </w:t>
+        <w:t>ubler</w:t>
+      </w:r>
+      <w:proofErr w:type="spellEnd"/>
+      <w:r>
+        <w:rPr>
+          <w:rFonts w:ascii="Arial" w:hAnsi="Arial" w:cs="Arial"/>
+        </w:rPr>
+        <w:t xml:space="preserve">, Thomas, Kenneth Benoit, Slava Mikhaylov, and Michael Laver. “Natural Sentences as Valid Units for Coded Political Texts.” </w:t>
       </w:r>
       <w:r>
         <w:rPr>
@@ -1646,7 +1801,7 @@
         </w:rPr>
         <w:t xml:space="preserve"> </w:t>
       </w:r>
-      <w:hyperlink r:id="rId30" w:history="1">
+      <w:hyperlink r:id="rId31" w:history="1">
         <w:r>
           <w:rPr>
             <w:rStyle w:val="Hyperlink"/>
@@ -1668,8 +1823,21 @@
         <w:rPr>
           <w:rFonts w:ascii="Arial" w:hAnsi="Arial" w:cs="Arial"/>
         </w:rPr>
-        <w:lastRenderedPageBreak/>
-        <w:t xml:space="preserve">2012. Benoit, Kenneth, Michael Laver, William Lowe, and Slava Mikhaylov. “How to scale coded text units without bias: A response to Gemenis.” </w:t>
+        <w:t xml:space="preserve">2012. Benoit, Kenneth, Michael Laver, William Lowe, and Slava Mikhaylov. “How to scale coded text units without bias: A response to </w:t>
+      </w:r>
+      <w:proofErr w:type="spellStart"/>
+      <w:r>
+        <w:rPr>
+          <w:rFonts w:ascii="Arial" w:hAnsi="Arial" w:cs="Arial"/>
+        </w:rPr>
+        <w:t>Gemenis</w:t>
+      </w:r>
+      <w:proofErr w:type="spellEnd"/>
+      <w:r>
+        <w:rPr>
+          <w:rFonts w:ascii="Arial" w:hAnsi="Arial" w:cs="Arial"/>
+        </w:rPr>
+        <w:t xml:space="preserve">.” </w:t>
       </w:r>
       <w:r>
         <w:rPr>
@@ -1696,7 +1864,7 @@
         </w:rPr>
         <w:t xml:space="preserve"> </w:t>
       </w:r>
-      <w:hyperlink r:id="rId31" w:history="1">
+      <w:hyperlink r:id="rId32" w:history="1">
         <w:r>
           <w:rPr>
             <w:rStyle w:val="Hyperlink"/>
@@ -1739,7 +1907,7 @@
         </w:rPr>
         <w:t xml:space="preserve"> </w:t>
       </w:r>
-      <w:hyperlink r:id="rId32" w:history="1">
+      <w:hyperlink r:id="rId33" w:history="1">
         <w:r>
           <w:rPr>
             <w:rStyle w:val="Hyperlink"/>
@@ -1787,7 +1955,7 @@
         </w:rPr>
         <w:t xml:space="preserve"> </w:t>
       </w:r>
-      <w:hyperlink r:id="rId33" w:history="1">
+      <w:hyperlink r:id="rId34" w:history="1">
         <w:r>
           <w:rPr>
             <w:rStyle w:val="Hyperlink"/>
@@ -1835,7 +2003,7 @@
         </w:rPr>
         <w:t xml:space="preserve"> </w:t>
       </w:r>
-      <w:hyperlink r:id="rId34" w:history="1">
+      <w:hyperlink r:id="rId35" w:history="1">
         <w:r>
           <w:rPr>
             <w:rStyle w:val="Hyperlink"/>
@@ -1883,7 +2051,7 @@
         </w:rPr>
         <w:t xml:space="preserve"> </w:t>
       </w:r>
-      <w:hyperlink r:id="rId35" w:history="1">
+      <w:hyperlink r:id="rId36" w:history="1">
         <w:r>
           <w:rPr>
             <w:rStyle w:val="Hyperlink"/>
@@ -1943,7 +2111,7 @@
         </w:rPr>
         <w:t xml:space="preserve"> </w:t>
       </w:r>
-      <w:hyperlink r:id="rId36" w:tgtFrame="_blank" w:history="1">
+      <w:hyperlink r:id="rId37" w:tgtFrame="_blank" w:history="1">
         <w:r>
           <w:rPr>
             <w:rStyle w:val="Hyperlink"/>
@@ -1991,7 +2159,7 @@
         </w:rPr>
         <w:t xml:space="preserve"> </w:t>
       </w:r>
-      <w:hyperlink r:id="rId37" w:history="1">
+      <w:hyperlink r:id="rId38" w:history="1">
         <w:r>
           <w:rPr>
             <w:rStyle w:val="Hyperlink"/>
@@ -2039,7 +2207,7 @@
         </w:rPr>
         <w:t xml:space="preserve"> </w:t>
       </w:r>
-      <w:hyperlink r:id="rId38" w:history="1">
+      <w:hyperlink r:id="rId39" w:history="1">
         <w:r>
           <w:rPr>
             <w:rStyle w:val="Hyperlink"/>
@@ -2060,7 +2228,21 @@
         <w:rPr>
           <w:rFonts w:ascii="Arial" w:hAnsi="Arial" w:cs="Arial"/>
         </w:rPr>
-        <w:t xml:space="preserve">2009. Nina Wiesehomeier and Kenneth Benoit. “Presidents, Parties And Policy Competition.” </w:t>
+        <w:t xml:space="preserve">2009. Nina </w:t>
+      </w:r>
+      <w:proofErr w:type="spellStart"/>
+      <w:r>
+        <w:rPr>
+          <w:rFonts w:ascii="Arial" w:hAnsi="Arial" w:cs="Arial"/>
+        </w:rPr>
+        <w:t>Wiesehomeier</w:t>
+      </w:r>
+      <w:proofErr w:type="spellEnd"/>
+      <w:r>
+        <w:rPr>
+          <w:rFonts w:ascii="Arial" w:hAnsi="Arial" w:cs="Arial"/>
+        </w:rPr>
+        <w:t xml:space="preserve"> and Kenneth Benoit. “Presidents, Parties And Policy Competition.” </w:t>
       </w:r>
       <w:r>
         <w:rPr>
@@ -2081,7 +2263,7 @@
         </w:rPr>
         <w:t xml:space="preserve">. </w:t>
       </w:r>
-      <w:hyperlink r:id="rId39" w:history="1">
+      <w:hyperlink r:id="rId40" w:history="1">
         <w:r>
           <w:rPr>
             <w:rStyle w:val="Hyperlink"/>
@@ -2135,7 +2317,7 @@
         </w:rPr>
         <w:t xml:space="preserve"> “</w:t>
       </w:r>
-      <w:hyperlink r:id="rId40" w:history="1">
+      <w:hyperlink r:id="rId41" w:history="1">
         <w:r>
           <w:rPr>
             <w:rStyle w:val="Hyperlink"/>
@@ -2221,7 +2403,7 @@
         </w:rPr>
         <w:t xml:space="preserve"> </w:t>
       </w:r>
-      <w:hyperlink r:id="rId41" w:history="1">
+      <w:hyperlink r:id="rId42" w:history="1">
         <w:r>
           <w:rPr>
             <w:rStyle w:val="Hyperlink"/>
@@ -2270,7 +2452,7 @@
         </w:rPr>
         <w:t xml:space="preserve"> </w:t>
       </w:r>
-      <w:hyperlink r:id="rId42" w:history="1">
+      <w:hyperlink r:id="rId43" w:history="1">
         <w:r>
           <w:rPr>
             <w:rStyle w:val="Hyperlink"/>
@@ -2330,7 +2512,7 @@
         </w:rPr>
         <w:t xml:space="preserve"> </w:t>
       </w:r>
-      <w:hyperlink r:id="rId43" w:history="1">
+      <w:hyperlink r:id="rId44" w:history="1">
         <w:r>
           <w:rPr>
             <w:rStyle w:val="Hyperlink"/>
@@ -2379,7 +2561,7 @@
         </w:rPr>
         <w:t xml:space="preserve"> </w:t>
       </w:r>
-      <w:hyperlink r:id="rId44" w:history="1">
+      <w:hyperlink r:id="rId45" w:history="1">
         <w:r>
           <w:rPr>
             <w:rStyle w:val="Hyperlink"/>
@@ -2400,13 +2582,42 @@
         <w:rPr>
           <w:rFonts w:ascii="Arial" w:hAnsi="Arial" w:cs="Arial"/>
         </w:rPr>
+        <w:lastRenderedPageBreak/>
         <w:t xml:space="preserve">2007. Laver, Michael and Kenneth Benoit. </w:t>
       </w:r>
       <w:r>
         <w:rPr>
           <w:rFonts w:ascii="Arial" w:hAnsi="Arial" w:cs="Arial"/>
         </w:rPr>
-        <w:t>“Le changement des systèmes partisans et la transformation des espaces politiques.”</w:t>
+        <w:t xml:space="preserve">“Le changement des </w:t>
+      </w:r>
+      <w:proofErr w:type="spellStart"/>
+      <w:r>
+        <w:rPr>
+          <w:rFonts w:ascii="Arial" w:hAnsi="Arial" w:cs="Arial"/>
+        </w:rPr>
+        <w:t>systèmes</w:t>
+      </w:r>
+      <w:proofErr w:type="spellEnd"/>
+      <w:r>
+        <w:rPr>
+          <w:rFonts w:ascii="Arial" w:hAnsi="Arial" w:cs="Arial"/>
+        </w:rPr>
+        <w:t xml:space="preserve"> partisans et la transformation des </w:t>
+      </w:r>
+      <w:proofErr w:type="spellStart"/>
+      <w:r>
+        <w:rPr>
+          <w:rFonts w:ascii="Arial" w:hAnsi="Arial" w:cs="Arial"/>
+        </w:rPr>
+        <w:t>espaces</w:t>
+      </w:r>
+      <w:proofErr w:type="spellEnd"/>
+      <w:r>
+        <w:rPr>
+          <w:rFonts w:ascii="Arial" w:hAnsi="Arial" w:cs="Arial"/>
+        </w:rPr>
+        <w:t xml:space="preserve"> politiques.”</w:t>
       </w:r>
       <w:r>
         <w:rPr>
@@ -2419,7 +2630,23 @@
           <w:rFonts w:ascii="Arial" w:hAnsi="Arial" w:cs="Arial"/>
           <w:i/>
         </w:rPr>
-        <w:t xml:space="preserve">Revue Internationale de Politique Comparée </w:t>
+        <w:t xml:space="preserve">Revue Internationale de Politique </w:t>
+      </w:r>
+      <w:proofErr w:type="spellStart"/>
+      <w:r>
+        <w:rPr>
+          <w:rFonts w:ascii="Arial" w:hAnsi="Arial" w:cs="Arial"/>
+          <w:i/>
+        </w:rPr>
+        <w:t>Comparée</w:t>
+      </w:r>
+      <w:proofErr w:type="spellEnd"/>
+      <w:r>
+        <w:rPr>
+          <w:rFonts w:ascii="Arial" w:hAnsi="Arial" w:cs="Arial"/>
+          <w:i/>
+        </w:rPr>
+        <w:t xml:space="preserve"> </w:t>
       </w:r>
       <w:r>
         <w:rPr>
@@ -2439,7 +2666,7 @@
         </w:rPr>
         <w:t xml:space="preserve"> </w:t>
       </w:r>
-      <w:hyperlink r:id="rId45" w:history="1">
+      <w:hyperlink r:id="rId46" w:history="1">
         <w:r>
           <w:rPr>
             <w:rStyle w:val="Hyperlink"/>
@@ -2460,7 +2687,6 @@
         <w:rPr>
           <w:rFonts w:ascii="Arial" w:hAnsi="Arial" w:cs="Arial"/>
         </w:rPr>
-        <w:lastRenderedPageBreak/>
         <w:t xml:space="preserve">2007. Benoit, Kenneth. “Electoral Laws as Political Consequences: Explaining the Origins and Change of Electoral Institutions.” </w:t>
       </w:r>
       <w:r>
@@ -2482,7 +2708,7 @@
         </w:rPr>
         <w:t xml:space="preserve"> </w:t>
       </w:r>
-      <w:hyperlink r:id="rId46" w:history="1">
+      <w:hyperlink r:id="rId47" w:history="1">
         <w:r>
           <w:rPr>
             <w:rStyle w:val="Hyperlink"/>
@@ -2530,7 +2756,7 @@
         </w:rPr>
         <w:t xml:space="preserve"> </w:t>
       </w:r>
-      <w:hyperlink r:id="rId47" w:history="1">
+      <w:hyperlink r:id="rId48" w:history="1">
         <w:r>
           <w:rPr>
             <w:rStyle w:val="Hyperlink"/>
@@ -2590,7 +2816,7 @@
         </w:rPr>
         <w:t xml:space="preserve"> </w:t>
       </w:r>
-      <w:hyperlink r:id="rId48" w:history="1">
+      <w:hyperlink r:id="rId49" w:history="1">
         <w:r>
           <w:rPr>
             <w:rStyle w:val="Hyperlink"/>
@@ -2639,7 +2865,7 @@
         </w:rPr>
         <w:t xml:space="preserve"> </w:t>
       </w:r>
-      <w:hyperlink r:id="rId49" w:history="1">
+      <w:hyperlink r:id="rId50" w:history="1">
         <w:r>
           <w:rPr>
             <w:rStyle w:val="Hyperlink"/>
@@ -2699,7 +2925,7 @@
         </w:rPr>
         <w:t xml:space="preserve"> </w:t>
       </w:r>
-      <w:hyperlink r:id="rId50" w:tgtFrame="_blank" w:history="1">
+      <w:hyperlink r:id="rId51" w:tgtFrame="_blank" w:history="1">
         <w:r>
           <w:rPr>
             <w:rStyle w:val="Hyperlink"/>
@@ -2748,7 +2974,7 @@
         </w:rPr>
         <w:t xml:space="preserve"> </w:t>
       </w:r>
-      <w:hyperlink r:id="rId51" w:history="1">
+      <w:hyperlink r:id="rId52" w:history="1">
         <w:r>
           <w:rPr>
             <w:rStyle w:val="Hyperlink"/>
@@ -2802,7 +3028,7 @@
         </w:rPr>
         <w:t xml:space="preserve"> </w:t>
       </w:r>
-      <w:hyperlink r:id="rId52" w:history="1">
+      <w:hyperlink r:id="rId53" w:history="1">
         <w:r>
           <w:rPr>
             <w:rStyle w:val="Hyperlink"/>
@@ -2857,7 +3083,7 @@
         </w:rPr>
         <w:t xml:space="preserve"> </w:t>
       </w:r>
-      <w:hyperlink r:id="rId53" w:history="1">
+      <w:hyperlink r:id="rId54" w:history="1">
         <w:r>
           <w:rPr>
             <w:rStyle w:val="Hyperlink"/>
@@ -2899,7 +3125,7 @@
         </w:rPr>
         <w:t xml:space="preserve"> </w:t>
       </w:r>
-      <w:hyperlink r:id="rId54" w:history="1">
+      <w:hyperlink r:id="rId55" w:history="1">
         <w:r>
           <w:rPr>
             <w:rStyle w:val="Hyperlink"/>
@@ -2921,13 +3147,41 @@
         <w:rPr>
           <w:rFonts w:ascii="Arial" w:hAnsi="Arial" w:cs="Arial"/>
         </w:rPr>
-        <w:t xml:space="preserve">2005. Benoit, Kenneth, Michael Laver, Christine Arnold, Madeleine O. Hosli, and Paul Pennings. </w:t>
-      </w:r>
-      <w:r>
-        <w:rPr>
-          <w:rFonts w:ascii="Arial" w:hAnsi="Arial" w:cs="Arial"/>
-        </w:rPr>
-        <w:t>“Measuring National Delegate Positions at the Convention on the Future of Europe Using Computerized Wordscoring.”</w:t>
+        <w:t xml:space="preserve">2005. Benoit, Kenneth, Michael Laver, Christine Arnold, Madeleine O. </w:t>
+      </w:r>
+      <w:proofErr w:type="spellStart"/>
+      <w:r>
+        <w:rPr>
+          <w:rFonts w:ascii="Arial" w:hAnsi="Arial" w:cs="Arial"/>
+        </w:rPr>
+        <w:t>Hosli</w:t>
+      </w:r>
+      <w:proofErr w:type="spellEnd"/>
+      <w:r>
+        <w:rPr>
+          <w:rFonts w:ascii="Arial" w:hAnsi="Arial" w:cs="Arial"/>
+        </w:rPr>
+        <w:t xml:space="preserve">, and Paul Pennings. </w:t>
+      </w:r>
+      <w:r>
+        <w:rPr>
+          <w:rFonts w:ascii="Arial" w:hAnsi="Arial" w:cs="Arial"/>
+        </w:rPr>
+        <w:t xml:space="preserve">“Measuring National Delegate Positions at the Convention on the Future of Europe Using Computerized </w:t>
+      </w:r>
+      <w:proofErr w:type="spellStart"/>
+      <w:r>
+        <w:rPr>
+          <w:rFonts w:ascii="Arial" w:hAnsi="Arial" w:cs="Arial"/>
+        </w:rPr>
+        <w:t>Wordscoring</w:t>
+      </w:r>
+      <w:proofErr w:type="spellEnd"/>
+      <w:r>
+        <w:rPr>
+          <w:rFonts w:ascii="Arial" w:hAnsi="Arial" w:cs="Arial"/>
+        </w:rPr>
+        <w:t>.”</w:t>
       </w:r>
       <w:r>
         <w:rPr>
@@ -2954,7 +3208,7 @@
         </w:rPr>
         <w:t xml:space="preserve"> </w:t>
       </w:r>
-      <w:hyperlink r:id="rId55" w:history="1">
+      <w:hyperlink r:id="rId56" w:history="1">
         <w:r>
           <w:rPr>
             <w:rStyle w:val="Hyperlink"/>
@@ -3054,7 +3308,7 @@
         </w:rPr>
         <w:t xml:space="preserve"> </w:t>
       </w:r>
-      <w:hyperlink r:id="rId56" w:history="1">
+      <w:hyperlink r:id="rId57" w:history="1">
         <w:r>
           <w:rPr>
             <w:rStyle w:val="Hyperlink"/>
@@ -3096,7 +3350,7 @@
         </w:rPr>
         <w:t xml:space="preserve"> </w:t>
       </w:r>
-      <w:hyperlink r:id="rId57" w:history="1"/>
+      <w:hyperlink r:id="rId58" w:history="1"/>
     </w:p>
     <w:p>
       <w:pPr>
@@ -3115,7 +3369,21 @@
         <w:rPr>
           <w:rFonts w:ascii="Arial" w:hAnsi="Arial" w:cs="Arial"/>
         </w:rPr>
-        <w:t>“Estimating Irish Party Positions Using Computer Wordscoring: The 2002 Elections.”</w:t>
+        <w:t xml:space="preserve">“Estimating Irish Party Positions Using Computer </w:t>
+      </w:r>
+      <w:proofErr w:type="spellStart"/>
+      <w:r>
+        <w:rPr>
+          <w:rFonts w:ascii="Arial" w:hAnsi="Arial" w:cs="Arial"/>
+        </w:rPr>
+        <w:t>Wordscoring</w:t>
+      </w:r>
+      <w:proofErr w:type="spellEnd"/>
+      <w:r>
+        <w:rPr>
+          <w:rFonts w:ascii="Arial" w:hAnsi="Arial" w:cs="Arial"/>
+        </w:rPr>
+        <w:t>: The 2002 Elections.”</w:t>
       </w:r>
       <w:r>
         <w:rPr>
@@ -3142,7 +3410,7 @@
         </w:rPr>
         <w:t xml:space="preserve"> </w:t>
       </w:r>
-      <w:hyperlink r:id="rId58" w:history="1">
+      <w:hyperlink r:id="rId59" w:history="1">
         <w:r>
           <w:rPr>
             <w:rStyle w:val="Hyperlink"/>
@@ -3163,6 +3431,7 @@
         <w:rPr>
           <w:rFonts w:ascii="Arial" w:hAnsi="Arial" w:cs="Arial"/>
         </w:rPr>
+        <w:lastRenderedPageBreak/>
         <w:t xml:space="preserve">2003. Benoit, Kenneth and Michael Marsh. </w:t>
       </w:r>
       <w:r>
@@ -3196,7 +3465,7 @@
         </w:rPr>
         <w:t xml:space="preserve"> </w:t>
       </w:r>
-      <w:hyperlink r:id="rId59" w:history="1">
+      <w:hyperlink r:id="rId60" w:history="1">
         <w:r>
           <w:rPr>
             <w:rStyle w:val="Hyperlink"/>
@@ -3217,7 +3486,6 @@
         <w:rPr>
           <w:rFonts w:ascii="Arial" w:hAnsi="Arial" w:cs="Arial"/>
         </w:rPr>
-        <w:lastRenderedPageBreak/>
         <w:t xml:space="preserve">2003. Laver, Michael, Kenneth Benoit, and John Garry. </w:t>
       </w:r>
       <w:r>
@@ -3251,7 +3519,7 @@
         </w:rPr>
         <w:t xml:space="preserve"> </w:t>
       </w:r>
-      <w:hyperlink r:id="rId60" w:history="1">
+      <w:hyperlink r:id="rId61" w:history="1">
         <w:r>
           <w:rPr>
             <w:rStyle w:val="Hyperlink"/>
@@ -3305,7 +3573,7 @@
         </w:rPr>
         <w:t xml:space="preserve"> </w:t>
       </w:r>
-      <w:hyperlink r:id="rId61" w:history="1">
+      <w:hyperlink r:id="rId62" w:history="1">
         <w:r>
           <w:rPr>
             <w:rStyle w:val="Hyperlink"/>
@@ -3365,7 +3633,7 @@
         </w:rPr>
         <w:t xml:space="preserve"> </w:t>
       </w:r>
-      <w:hyperlink r:id="rId62" w:history="1">
+      <w:hyperlink r:id="rId63" w:history="1">
         <w:r>
           <w:rPr>
             <w:rStyle w:val="Hyperlink"/>
@@ -3392,7 +3660,21 @@
         <w:rPr>
           <w:rFonts w:ascii="Arial" w:hAnsi="Arial" w:cs="Arial"/>
         </w:rPr>
-        <w:t>“Locating TDs in Policy Spaces: Wordscoring Dáil Speeches.”</w:t>
+        <w:t xml:space="preserve">“Locating TDs in Policy Spaces: </w:t>
+      </w:r>
+      <w:proofErr w:type="spellStart"/>
+      <w:r>
+        <w:rPr>
+          <w:rFonts w:ascii="Arial" w:hAnsi="Arial" w:cs="Arial"/>
+        </w:rPr>
+        <w:t>Wordscoring</w:t>
+      </w:r>
+      <w:proofErr w:type="spellEnd"/>
+      <w:r>
+        <w:rPr>
+          <w:rFonts w:ascii="Arial" w:hAnsi="Arial" w:cs="Arial"/>
+        </w:rPr>
+        <w:t xml:space="preserve"> Dáil Speeches.”</w:t>
       </w:r>
       <w:r>
         <w:rPr>
@@ -3419,7 +3701,7 @@
         </w:rPr>
         <w:t xml:space="preserve"> </w:t>
       </w:r>
-      <w:hyperlink r:id="rId63" w:history="1">
+      <w:hyperlink r:id="rId64" w:history="1">
         <w:r>
           <w:rPr>
             <w:rStyle w:val="Hyperlink"/>
@@ -3446,7 +3728,21 @@
         <w:rPr>
           <w:rFonts w:ascii="Arial" w:hAnsi="Arial" w:cs="Arial"/>
         </w:rPr>
-        <w:t>“The Endogeneity Problem in Electoral Studies: A Critical Reexamination of Duverger’s Mechanical Effect.”</w:t>
+        <w:t xml:space="preserve">“The Endogeneity Problem in Electoral Studies: A Critical </w:t>
+      </w:r>
+      <w:proofErr w:type="spellStart"/>
+      <w:r>
+        <w:rPr>
+          <w:rFonts w:ascii="Arial" w:hAnsi="Arial" w:cs="Arial"/>
+        </w:rPr>
+        <w:t>Reexamination</w:t>
+      </w:r>
+      <w:proofErr w:type="spellEnd"/>
+      <w:r>
+        <w:rPr>
+          <w:rFonts w:ascii="Arial" w:hAnsi="Arial" w:cs="Arial"/>
+        </w:rPr>
+        <w:t xml:space="preserve"> of Duverger’s Mechanical Effect.”</w:t>
       </w:r>
       <w:r>
         <w:rPr>
@@ -3473,7 +3769,7 @@
         </w:rPr>
         <w:t xml:space="preserve"> </w:t>
       </w:r>
-      <w:hyperlink r:id="rId64" w:history="1">
+      <w:hyperlink r:id="rId65" w:history="1">
         <w:r>
           <w:rPr>
             <w:rStyle w:val="Hyperlink"/>
@@ -3528,7 +3824,7 @@
         </w:rPr>
         <w:t xml:space="preserve"> </w:t>
       </w:r>
-      <w:hyperlink r:id="rId65" w:history="1">
+      <w:hyperlink r:id="rId66" w:history="1">
         <w:r>
           <w:rPr>
             <w:rStyle w:val="Hyperlink"/>
@@ -3576,7 +3872,7 @@
         </w:rPr>
         <w:t xml:space="preserve"> </w:t>
       </w:r>
-      <w:hyperlink r:id="rId66" w:history="1">
+      <w:hyperlink r:id="rId67" w:history="1">
         <w:r>
           <w:rPr>
             <w:rStyle w:val="Hyperlink"/>
@@ -3632,7 +3928,7 @@
         </w:rPr>
         <w:t xml:space="preserve"> </w:t>
       </w:r>
-      <w:hyperlink r:id="rId67" w:history="1">
+      <w:hyperlink r:id="rId68" w:history="1">
         <w:r>
           <w:rPr>
             <w:rStyle w:val="Hyperlink"/>
@@ -3674,6 +3970,7 @@
         </w:rPr>
         <w:t xml:space="preserve">and </w:t>
       </w:r>
+      <w:proofErr w:type="spellStart"/>
       <w:r>
         <w:rPr>
           <w:rFonts w:ascii="Arial" w:eastAsia="Calibri" w:hAnsi="Arial" w:cs="Arial"/>
@@ -3681,6 +3978,7 @@
         </w:rPr>
         <w:t>EzI</w:t>
       </w:r>
+      <w:proofErr w:type="spellEnd"/>
       <w:r>
         <w:rPr>
           <w:rFonts w:ascii="Arial" w:hAnsi="Arial" w:cs="Arial"/>
@@ -3706,7 +4004,7 @@
         </w:rPr>
         <w:t xml:space="preserve">14(4):433-438. </w:t>
       </w:r>
-      <w:hyperlink r:id="rId68" w:anchor=":~:text=EI%20allows%20users%20to%20make,afforded%20by%20the%20Gauss%20version." w:history="1">
+      <w:hyperlink r:id="rId69" w:anchor=":~:text=EI%20allows%20users%20to%20make,afforded%20by%20the%20Gauss%20version." w:history="1">
         <w:r>
           <w:rPr>
             <w:rStyle w:val="Hyperlink"/>
@@ -3747,7 +4045,7 @@
         </w:rPr>
         <w:t>“</w:t>
       </w:r>
-      <w:hyperlink r:id="rId69" w:history="1">
+      <w:hyperlink r:id="rId70" w:history="1">
         <w:r>
           <w:rPr>
             <w:rStyle w:val="Hyperlink"/>
@@ -3787,7 +4085,7 @@
         </w:rPr>
         <w:t xml:space="preserve"> </w:t>
       </w:r>
-      <w:hyperlink r:id="rId70" w:history="1">
+      <w:hyperlink r:id="rId71" w:history="1">
         <w:r>
           <w:rPr>
             <w:rStyle w:val="Hyperlink"/>
@@ -3815,7 +4113,21 @@
         <w:rPr>
           <w:rFonts w:ascii="Arial" w:hAnsi="Arial" w:cs="Arial"/>
         </w:rPr>
-        <w:t>“Democracies Really Are More Pacific (In General): Reexamining Regime Type and War Involvement.”</w:t>
+        <w:t xml:space="preserve">“Democracies Really Are More Pacific (In General): </w:t>
+      </w:r>
+      <w:proofErr w:type="spellStart"/>
+      <w:r>
+        <w:rPr>
+          <w:rFonts w:ascii="Arial" w:hAnsi="Arial" w:cs="Arial"/>
+        </w:rPr>
+        <w:t>Reexamining</w:t>
+      </w:r>
+      <w:proofErr w:type="spellEnd"/>
+      <w:r>
+        <w:rPr>
+          <w:rFonts w:ascii="Arial" w:hAnsi="Arial" w:cs="Arial"/>
+        </w:rPr>
+        <w:t xml:space="preserve"> Regime Type and War Involvement.”</w:t>
       </w:r>
       <w:r>
         <w:rPr>
@@ -3842,7 +4154,7 @@
         </w:rPr>
         <w:t xml:space="preserve"> </w:t>
       </w:r>
-      <w:hyperlink r:id="rId71" w:history="1">
+      <w:hyperlink r:id="rId72" w:history="1">
         <w:r>
           <w:rPr>
             <w:rStyle w:val="Hyperlink"/>
@@ -3910,7 +4222,7 @@
         </w:rPr>
         <w:t xml:space="preserve">2006. Benoit, Kenneth and Michael Laver. </w:t>
       </w:r>
-      <w:hyperlink r:id="rId72" w:history="1">
+      <w:hyperlink r:id="rId73" w:history="1">
         <w:r>
           <w:rPr>
             <w:rStyle w:val="Hyperlink"/>
@@ -3940,6 +4252,7 @@
         <w:rPr>
           <w:rFonts w:ascii="Arial" w:hAnsi="Arial" w:cs="Arial"/>
         </w:rPr>
+        <w:lastRenderedPageBreak/>
         <w:t>Software and Datasets</w:t>
       </w:r>
     </w:p>
@@ -3954,9 +4267,205 @@
         <w:rPr>
           <w:rFonts w:ascii="Arial" w:hAnsi="Arial" w:cs="Arial"/>
         </w:rPr>
-        <w:t xml:space="preserve">2012–present. The quanteda family of R packages for the quantitative analysis of textual data, comprising quanteda, quanteda.textstats, quanteda.textplots, quanteda.textmodels, quanteda.tidy, readtext, spacyr, quanteda.corpora, quanteda.dictionaries, stopwords, and nsyllable, together with related packages developed with co-authors, including tokenizers, quallmer, and quallmer.app. Available from </w:t>
-      </w:r>
-      <w:hyperlink r:id="rId73">
+        <w:t xml:space="preserve">2012–present. The </w:t>
+      </w:r>
+      <w:proofErr w:type="spellStart"/>
+      <w:r>
+        <w:rPr>
+          <w:rFonts w:ascii="Arial" w:hAnsi="Arial" w:cs="Arial"/>
+        </w:rPr>
+        <w:t>quanteda</w:t>
+      </w:r>
+      <w:proofErr w:type="spellEnd"/>
+      <w:r>
+        <w:rPr>
+          <w:rFonts w:ascii="Arial" w:hAnsi="Arial" w:cs="Arial"/>
+        </w:rPr>
+        <w:t xml:space="preserve"> family of R packages for the quantitative analysis of textual data, comprising </w:t>
+      </w:r>
+      <w:proofErr w:type="spellStart"/>
+      <w:r>
+        <w:rPr>
+          <w:rFonts w:ascii="Arial" w:hAnsi="Arial" w:cs="Arial"/>
+        </w:rPr>
+        <w:t>quanteda</w:t>
+      </w:r>
+      <w:proofErr w:type="spellEnd"/>
+      <w:r>
+        <w:rPr>
+          <w:rFonts w:ascii="Arial" w:hAnsi="Arial" w:cs="Arial"/>
+        </w:rPr>
+        <w:t xml:space="preserve">, </w:t>
+      </w:r>
+      <w:proofErr w:type="spellStart"/>
+      <w:r>
+        <w:rPr>
+          <w:rFonts w:ascii="Arial" w:hAnsi="Arial" w:cs="Arial"/>
+        </w:rPr>
+        <w:t>quanteda.textstats</w:t>
+      </w:r>
+      <w:proofErr w:type="spellEnd"/>
+      <w:r>
+        <w:rPr>
+          <w:rFonts w:ascii="Arial" w:hAnsi="Arial" w:cs="Arial"/>
+        </w:rPr>
+        <w:t xml:space="preserve">, </w:t>
+      </w:r>
+      <w:proofErr w:type="spellStart"/>
+      <w:r>
+        <w:rPr>
+          <w:rFonts w:ascii="Arial" w:hAnsi="Arial" w:cs="Arial"/>
+        </w:rPr>
+        <w:t>quanteda.textplots</w:t>
+      </w:r>
+      <w:proofErr w:type="spellEnd"/>
+      <w:r>
+        <w:rPr>
+          <w:rFonts w:ascii="Arial" w:hAnsi="Arial" w:cs="Arial"/>
+        </w:rPr>
+        <w:t xml:space="preserve">, </w:t>
+      </w:r>
+      <w:proofErr w:type="spellStart"/>
+      <w:r>
+        <w:rPr>
+          <w:rFonts w:ascii="Arial" w:hAnsi="Arial" w:cs="Arial"/>
+        </w:rPr>
+        <w:t>quanteda.textmodels</w:t>
+      </w:r>
+      <w:proofErr w:type="spellEnd"/>
+      <w:r>
+        <w:rPr>
+          <w:rFonts w:ascii="Arial" w:hAnsi="Arial" w:cs="Arial"/>
+        </w:rPr>
+        <w:t xml:space="preserve">, </w:t>
+      </w:r>
+      <w:proofErr w:type="spellStart"/>
+      <w:r>
+        <w:rPr>
+          <w:rFonts w:ascii="Arial" w:hAnsi="Arial" w:cs="Arial"/>
+        </w:rPr>
+        <w:t>quanteda.tidy</w:t>
+      </w:r>
+      <w:proofErr w:type="spellEnd"/>
+      <w:r>
+        <w:rPr>
+          <w:rFonts w:ascii="Arial" w:hAnsi="Arial" w:cs="Arial"/>
+        </w:rPr>
+        <w:t xml:space="preserve">, </w:t>
+      </w:r>
+      <w:proofErr w:type="spellStart"/>
+      <w:r>
+        <w:rPr>
+          <w:rFonts w:ascii="Arial" w:hAnsi="Arial" w:cs="Arial"/>
+        </w:rPr>
+        <w:t>readtext</w:t>
+      </w:r>
+      <w:proofErr w:type="spellEnd"/>
+      <w:r>
+        <w:rPr>
+          <w:rFonts w:ascii="Arial" w:hAnsi="Arial" w:cs="Arial"/>
+        </w:rPr>
+        <w:t xml:space="preserve">, </w:t>
+      </w:r>
+      <w:proofErr w:type="spellStart"/>
+      <w:r>
+        <w:rPr>
+          <w:rFonts w:ascii="Arial" w:hAnsi="Arial" w:cs="Arial"/>
+        </w:rPr>
+        <w:t>spacyr</w:t>
+      </w:r>
+      <w:proofErr w:type="spellEnd"/>
+      <w:r>
+        <w:rPr>
+          <w:rFonts w:ascii="Arial" w:hAnsi="Arial" w:cs="Arial"/>
+        </w:rPr>
+        <w:t xml:space="preserve">, </w:t>
+      </w:r>
+      <w:proofErr w:type="spellStart"/>
+      <w:r>
+        <w:rPr>
+          <w:rFonts w:ascii="Arial" w:hAnsi="Arial" w:cs="Arial"/>
+        </w:rPr>
+        <w:t>quanteda.corpora</w:t>
+      </w:r>
+      <w:proofErr w:type="spellEnd"/>
+      <w:r>
+        <w:rPr>
+          <w:rFonts w:ascii="Arial" w:hAnsi="Arial" w:cs="Arial"/>
+        </w:rPr>
+        <w:t xml:space="preserve">, </w:t>
+      </w:r>
+      <w:proofErr w:type="spellStart"/>
+      <w:r>
+        <w:rPr>
+          <w:rFonts w:ascii="Arial" w:hAnsi="Arial" w:cs="Arial"/>
+        </w:rPr>
+        <w:t>quanteda.dictionaries</w:t>
+      </w:r>
+      <w:proofErr w:type="spellEnd"/>
+      <w:r>
+        <w:rPr>
+          <w:rFonts w:ascii="Arial" w:hAnsi="Arial" w:cs="Arial"/>
+        </w:rPr>
+        <w:t xml:space="preserve">, </w:t>
+      </w:r>
+      <w:proofErr w:type="spellStart"/>
+      <w:r>
+        <w:rPr>
+          <w:rFonts w:ascii="Arial" w:hAnsi="Arial" w:cs="Arial"/>
+        </w:rPr>
+        <w:t>stopwords</w:t>
+      </w:r>
+      <w:proofErr w:type="spellEnd"/>
+      <w:r>
+        <w:rPr>
+          <w:rFonts w:ascii="Arial" w:hAnsi="Arial" w:cs="Arial"/>
+        </w:rPr>
+        <w:t xml:space="preserve">, and </w:t>
+      </w:r>
+      <w:proofErr w:type="spellStart"/>
+      <w:r>
+        <w:rPr>
+          <w:rFonts w:ascii="Arial" w:hAnsi="Arial" w:cs="Arial"/>
+        </w:rPr>
+        <w:t>nsyllable</w:t>
+      </w:r>
+      <w:proofErr w:type="spellEnd"/>
+      <w:r>
+        <w:rPr>
+          <w:rFonts w:ascii="Arial" w:hAnsi="Arial" w:cs="Arial"/>
+        </w:rPr>
+        <w:t xml:space="preserve">, together with related packages developed with co-authors, including tokenizers, </w:t>
+      </w:r>
+      <w:proofErr w:type="spellStart"/>
+      <w:r>
+        <w:rPr>
+          <w:rFonts w:ascii="Arial" w:hAnsi="Arial" w:cs="Arial"/>
+        </w:rPr>
+        <w:t>quallmer</w:t>
+      </w:r>
+      <w:proofErr w:type="spellEnd"/>
+      <w:r>
+        <w:rPr>
+          <w:rFonts w:ascii="Arial" w:hAnsi="Arial" w:cs="Arial"/>
+        </w:rPr>
+        <w:t xml:space="preserve">, and </w:t>
+      </w:r>
+      <w:proofErr w:type="spellStart"/>
+      <w:r>
+        <w:rPr>
+          <w:rFonts w:ascii="Arial" w:hAnsi="Arial" w:cs="Arial"/>
+        </w:rPr>
+        <w:t>quallmer.app</w:t>
+      </w:r>
+      <w:proofErr w:type="spellEnd"/>
+      <w:r>
+        <w:rPr>
+          <w:rFonts w:ascii="Arial" w:hAnsi="Arial" w:cs="Arial"/>
+        </w:rPr>
+        <w:t xml:space="preserve">. Available from </w:t>
+      </w:r>
+      <w:hyperlink r:id="rId74">
         <w:r>
           <w:rPr>
             <w:rFonts w:ascii="Arial" w:eastAsia="Calibri" w:hAnsi="Arial" w:cs="Arial"/>
@@ -3965,7 +4474,7 @@
           <w:t>http://github.com/quanteda/quanteda</w:t>
         </w:r>
       </w:hyperlink>
-      <w:hyperlink r:id="rId74">
+      <w:hyperlink r:id="rId75">
         <w:r>
           <w:rPr>
             <w:rFonts w:ascii="Arial" w:hAnsi="Arial" w:cs="Arial"/>
@@ -3992,7 +4501,6 @@
         <w:rPr>
           <w:rFonts w:ascii="Arial" w:hAnsi="Arial" w:cs="Arial"/>
         </w:rPr>
-        <w:lastRenderedPageBreak/>
         <w:t xml:space="preserve">2004–2005. Benoit, Kenneth and Michael Laver. </w:t>
       </w:r>
       <w:r>
@@ -4030,12 +4538,21 @@
         </w:rPr>
         <w:t xml:space="preserve">2002-2004. Benoit, Kenneth. </w:t>
       </w:r>
-      <w:r>
-        <w:rPr>
-          <w:rFonts w:ascii="Arial" w:hAnsi="Arial" w:cs="Arial"/>
-          <w:i/>
-        </w:rPr>
-        <w:t>Wordscores: Software for Coding Political Texts</w:t>
+      <w:proofErr w:type="spellStart"/>
+      <w:r>
+        <w:rPr>
+          <w:rFonts w:ascii="Arial" w:hAnsi="Arial" w:cs="Arial"/>
+          <w:i/>
+        </w:rPr>
+        <w:t>Wordscores</w:t>
+      </w:r>
+      <w:proofErr w:type="spellEnd"/>
+      <w:r>
+        <w:rPr>
+          <w:rFonts w:ascii="Arial" w:hAnsi="Arial" w:cs="Arial"/>
+          <w:i/>
+        </w:rPr>
+        <w:t>: Software for Coding Political Texts</w:t>
       </w:r>
       <w:r>
         <w:rPr>
@@ -4099,6 +4616,7 @@
         </w:rPr>
         <w:t>1996–2002. Benoit, Kenneth and Gary King. “</w:t>
       </w:r>
+      <w:proofErr w:type="spellStart"/>
       <w:r>
         <w:rPr>
           <w:rFonts w:ascii="Arial" w:eastAsia="Calibri" w:hAnsi="Arial" w:cs="Arial"/>
@@ -4106,6 +4624,7 @@
         </w:rPr>
         <w:t>EzI</w:t>
       </w:r>
+      <w:proofErr w:type="spellEnd"/>
       <w:r>
         <w:rPr>
           <w:rFonts w:ascii="Arial" w:hAnsi="Arial" w:cs="Arial"/>
@@ -4209,7 +4728,7 @@
         </w:rPr>
         <w:t>2020. “</w:t>
       </w:r>
-      <w:hyperlink r:id="rId75" w:history="1">
+      <w:hyperlink r:id="rId76" w:history="1">
         <w:r>
           <w:rPr>
             <w:rStyle w:val="Hyperlink"/>
@@ -4228,7 +4747,21 @@
         <w:rPr>
           <w:rFonts w:ascii="Arial" w:hAnsi="Arial" w:cs="Arial"/>
         </w:rPr>
-        <w:t>In Curini, Luigi</w:t>
+        <w:t xml:space="preserve">In </w:t>
+      </w:r>
+      <w:proofErr w:type="spellStart"/>
+      <w:r>
+        <w:rPr>
+          <w:rFonts w:ascii="Arial" w:hAnsi="Arial" w:cs="Arial"/>
+        </w:rPr>
+        <w:t>Curini</w:t>
+      </w:r>
+      <w:proofErr w:type="spellEnd"/>
+      <w:r>
+        <w:rPr>
+          <w:rFonts w:ascii="Arial" w:hAnsi="Arial" w:cs="Arial"/>
+        </w:rPr>
+        <w:t>, Luigi</w:t>
       </w:r>
       <w:r>
         <w:rPr>
@@ -4261,7 +4794,21 @@
         <w:rPr>
           <w:rFonts w:ascii="Arial" w:hAnsi="Arial" w:cs="Arial"/>
         </w:rPr>
-        <w:t xml:space="preserve">2019. Benoit, Kenneth, Kevin Munger, and Arthur Spirling. “Dumbing Down? Trends in the Complexity of Political Communication.” In Frances Lee and </w:t>
+        <w:t xml:space="preserve">2019. Benoit, Kenneth, Kevin Munger, and Arthur </w:t>
+      </w:r>
+      <w:proofErr w:type="spellStart"/>
+      <w:r>
+        <w:rPr>
+          <w:rFonts w:ascii="Arial" w:hAnsi="Arial" w:cs="Arial"/>
+        </w:rPr>
+        <w:t>Spirling</w:t>
+      </w:r>
+      <w:proofErr w:type="spellEnd"/>
+      <w:r>
+        <w:rPr>
+          <w:rFonts w:ascii="Arial" w:hAnsi="Arial" w:cs="Arial"/>
+        </w:rPr>
+        <w:t xml:space="preserve">. “Dumbing Down? Trends in the Complexity of Political Communication.” In Frances Lee and </w:t>
       </w:r>
       <w:r>
         <w:rPr>
@@ -4307,13 +4854,13 @@
           <w:rFonts w:ascii="Arial" w:hAnsi="Arial" w:cs="Arial"/>
           <w:i/>
         </w:rPr>
-        <w:t xml:space="preserve">Analytics, Policy and Governance</w:t>
-      </w:r>
-      <w:r>
-        <w:rPr>
-          <w:rFonts w:ascii="Arial" w:hAnsi="Arial" w:cs="Arial"/>
-        </w:rPr>
-        <w:t xml:space="preserve">. New Haven: Yale University Press. pp. 137–159.</w:t>
+        <w:t>Analytics, Policy and Governance</w:t>
+      </w:r>
+      <w:r>
+        <w:rPr>
+          <w:rFonts w:ascii="Arial" w:hAnsi="Arial" w:cs="Arial"/>
+        </w:rPr>
+        <w:t>. New Haven: Yale University Press. pp. 137–159.</w:t>
       </w:r>
     </w:p>
     <w:p>
@@ -4384,58 +4931,6 @@
           <w:rFonts w:ascii="Arial" w:hAnsi="Arial" w:cs="Arial"/>
         </w:rPr>
         <w:t xml:space="preserve">2008. Giannetti, Daniela and Kenneth Benoit. “Intra-party politics and coalition governments in parliamentary democracies.” In </w:t>
-      </w:r>
-      <w:hyperlink r:id="rId76" w:anchor="v=onepage&amp;q=&amp;f=false" w:history="1">
-        <w:r>
-          <w:rPr>
-            <w:rStyle w:val="Hyperlink"/>
-            <w:rFonts w:ascii="Arial" w:hAnsi="Arial" w:cs="Arial"/>
-            <w:i/>
-          </w:rPr>
-          <w:t>Intra-Party Politics and Coalition Governments in Parliamentary Democracies</w:t>
-        </w:r>
-        <w:r>
-          <w:rPr>
-            <w:rStyle w:val="Hyperlink"/>
-            <w:rFonts w:ascii="Arial" w:hAnsi="Arial" w:cs="Arial"/>
-          </w:rPr>
-          <w:t>,</w:t>
-        </w:r>
-      </w:hyperlink>
-      <w:r>
-        <w:rPr>
-          <w:rFonts w:ascii="Arial" w:hAnsi="Arial" w:cs="Arial"/>
-        </w:rPr>
-        <w:t xml:space="preserve"> eds. Daniela Giannetti and Kenneth Benoit. London: Routledge.</w:t>
-      </w:r>
-    </w:p>
-    <w:p>
-      <w:pPr>
-        <w:ind w:left="386" w:right="591" w:firstLine="0"/>
-        <w:rPr>
-          <w:rFonts w:ascii="Arial" w:hAnsi="Arial" w:cs="Arial"/>
-        </w:rPr>
-      </w:pPr>
-      <w:r>
-        <w:rPr>
-          <w:rFonts w:ascii="Arial" w:hAnsi="Arial" w:cs="Arial"/>
-        </w:rPr>
-        <w:t>pp3–24.</w:t>
-      </w:r>
-    </w:p>
-    <w:p>
-      <w:pPr>
-        <w:spacing w:after="101"/>
-        <w:ind w:left="381" w:right="591"/>
-        <w:rPr>
-          <w:rFonts w:ascii="Arial" w:hAnsi="Arial" w:cs="Arial"/>
-        </w:rPr>
-      </w:pPr>
-      <w:r>
-        <w:rPr>
-          <w:rFonts w:ascii="Arial" w:hAnsi="Arial" w:cs="Arial"/>
-        </w:rPr>
-        <w:t xml:space="preserve">2008. Benoit, Kenneth and Daniela Giannetti. “Intra-party politics and coalition governance: concluding remarks.” In </w:t>
       </w:r>
       <w:hyperlink r:id="rId77" w:anchor="v=onepage&amp;q=&amp;f=false" w:history="1">
         <w:r>
@@ -4458,6 +4953,59 @@
         <w:rPr>
           <w:rFonts w:ascii="Arial" w:hAnsi="Arial" w:cs="Arial"/>
         </w:rPr>
+        <w:t xml:space="preserve"> eds. Daniela Giannetti and Kenneth Benoit. London: Routledge.</w:t>
+      </w:r>
+    </w:p>
+    <w:p>
+      <w:pPr>
+        <w:ind w:left="386" w:right="591" w:firstLine="0"/>
+        <w:rPr>
+          <w:rFonts w:ascii="Arial" w:hAnsi="Arial" w:cs="Arial"/>
+        </w:rPr>
+      </w:pPr>
+      <w:r>
+        <w:rPr>
+          <w:rFonts w:ascii="Arial" w:hAnsi="Arial" w:cs="Arial"/>
+        </w:rPr>
+        <w:lastRenderedPageBreak/>
+        <w:t>pp3–24.</w:t>
+      </w:r>
+    </w:p>
+    <w:p>
+      <w:pPr>
+        <w:spacing w:after="101"/>
+        <w:ind w:left="381" w:right="591"/>
+        <w:rPr>
+          <w:rFonts w:ascii="Arial" w:hAnsi="Arial" w:cs="Arial"/>
+        </w:rPr>
+      </w:pPr>
+      <w:r>
+        <w:rPr>
+          <w:rFonts w:ascii="Arial" w:hAnsi="Arial" w:cs="Arial"/>
+        </w:rPr>
+        <w:t xml:space="preserve">2008. Benoit, Kenneth and Daniela Giannetti. “Intra-party politics and coalition governance: concluding remarks.” In </w:t>
+      </w:r>
+      <w:hyperlink r:id="rId78" w:anchor="v=onepage&amp;q=&amp;f=false" w:history="1">
+        <w:r>
+          <w:rPr>
+            <w:rStyle w:val="Hyperlink"/>
+            <w:rFonts w:ascii="Arial" w:hAnsi="Arial" w:cs="Arial"/>
+            <w:i/>
+          </w:rPr>
+          <w:t>Intra-Party Politics and Coalition Governments in Parliamentary Democracies</w:t>
+        </w:r>
+        <w:r>
+          <w:rPr>
+            <w:rStyle w:val="Hyperlink"/>
+            <w:rFonts w:ascii="Arial" w:hAnsi="Arial" w:cs="Arial"/>
+          </w:rPr>
+          <w:t>,</w:t>
+        </w:r>
+      </w:hyperlink>
+      <w:r>
+        <w:rPr>
+          <w:rFonts w:ascii="Arial" w:hAnsi="Arial" w:cs="Arial"/>
+        </w:rPr>
         <w:t xml:space="preserve"> eds. Daniela Giannetti and Kenneth Benoit. London: Routledge. pp229–235.</w:t>
       </w:r>
     </w:p>
@@ -4474,7 +5022,7 @@
         </w:rPr>
         <w:t xml:space="preserve">2008. Benoit, Kenneth and Nina Wiesehomeier. </w:t>
       </w:r>
-      <w:hyperlink r:id="rId78" w:anchor="v=onepage&amp;q&amp;f=false" w:history="1">
+      <w:hyperlink r:id="rId79" w:anchor="v=onepage&amp;q&amp;f=false" w:history="1">
         <w:r>
           <w:rPr>
             <w:rStyle w:val="Hyperlink"/>
@@ -4489,13 +5037,127 @@
         </w:rPr>
         <w:t xml:space="preserve"> In </w:t>
       </w:r>
-      <w:r>
-        <w:rPr>
-          <w:rFonts w:ascii="Arial" w:hAnsi="Arial" w:cs="Arial"/>
-          <w:i/>
-        </w:rPr>
-        <w:t>Neuere Entwicklungen und Anwendungen auf dem Gebiet der Methoden der vergleichenden Politik- und Sozialwissenschaft</w:t>
-      </w:r>
+      <w:proofErr w:type="spellStart"/>
+      <w:r>
+        <w:rPr>
+          <w:rFonts w:ascii="Arial" w:hAnsi="Arial" w:cs="Arial"/>
+          <w:i/>
+        </w:rPr>
+        <w:t>Neuere</w:t>
+      </w:r>
+      <w:proofErr w:type="spellEnd"/>
+      <w:r>
+        <w:rPr>
+          <w:rFonts w:ascii="Arial" w:hAnsi="Arial" w:cs="Arial"/>
+          <w:i/>
+        </w:rPr>
+        <w:t xml:space="preserve"> </w:t>
+      </w:r>
+      <w:proofErr w:type="spellStart"/>
+      <w:r>
+        <w:rPr>
+          <w:rFonts w:ascii="Arial" w:hAnsi="Arial" w:cs="Arial"/>
+          <w:i/>
+        </w:rPr>
+        <w:t>Entwicklungen</w:t>
+      </w:r>
+      <w:proofErr w:type="spellEnd"/>
+      <w:r>
+        <w:rPr>
+          <w:rFonts w:ascii="Arial" w:hAnsi="Arial" w:cs="Arial"/>
+          <w:i/>
+        </w:rPr>
+        <w:t xml:space="preserve"> und </w:t>
+      </w:r>
+      <w:proofErr w:type="spellStart"/>
+      <w:r>
+        <w:rPr>
+          <w:rFonts w:ascii="Arial" w:hAnsi="Arial" w:cs="Arial"/>
+          <w:i/>
+        </w:rPr>
+        <w:t>Anwendungen</w:t>
+      </w:r>
+      <w:proofErr w:type="spellEnd"/>
+      <w:r>
+        <w:rPr>
+          <w:rFonts w:ascii="Arial" w:hAnsi="Arial" w:cs="Arial"/>
+          <w:i/>
+        </w:rPr>
+        <w:t xml:space="preserve"> auf </w:t>
+      </w:r>
+      <w:proofErr w:type="spellStart"/>
+      <w:r>
+        <w:rPr>
+          <w:rFonts w:ascii="Arial" w:hAnsi="Arial" w:cs="Arial"/>
+          <w:i/>
+        </w:rPr>
+        <w:t>dem</w:t>
+      </w:r>
+      <w:proofErr w:type="spellEnd"/>
+      <w:r>
+        <w:rPr>
+          <w:rFonts w:ascii="Arial" w:hAnsi="Arial" w:cs="Arial"/>
+          <w:i/>
+        </w:rPr>
+        <w:t xml:space="preserve"> </w:t>
+      </w:r>
+      <w:proofErr w:type="spellStart"/>
+      <w:r>
+        <w:rPr>
+          <w:rFonts w:ascii="Arial" w:hAnsi="Arial" w:cs="Arial"/>
+          <w:i/>
+        </w:rPr>
+        <w:t>Gebiet</w:t>
+      </w:r>
+      <w:proofErr w:type="spellEnd"/>
+      <w:r>
+        <w:rPr>
+          <w:rFonts w:ascii="Arial" w:hAnsi="Arial" w:cs="Arial"/>
+          <w:i/>
+        </w:rPr>
+        <w:t xml:space="preserve"> der </w:t>
+      </w:r>
+      <w:proofErr w:type="spellStart"/>
+      <w:r>
+        <w:rPr>
+          <w:rFonts w:ascii="Arial" w:hAnsi="Arial" w:cs="Arial"/>
+          <w:i/>
+        </w:rPr>
+        <w:t>Methoden</w:t>
+      </w:r>
+      <w:proofErr w:type="spellEnd"/>
+      <w:r>
+        <w:rPr>
+          <w:rFonts w:ascii="Arial" w:hAnsi="Arial" w:cs="Arial"/>
+          <w:i/>
+        </w:rPr>
+        <w:t xml:space="preserve"> der </w:t>
+      </w:r>
+      <w:proofErr w:type="spellStart"/>
+      <w:r>
+        <w:rPr>
+          <w:rFonts w:ascii="Arial" w:hAnsi="Arial" w:cs="Arial"/>
+          <w:i/>
+        </w:rPr>
+        <w:t>vergleichenden</w:t>
+      </w:r>
+      <w:proofErr w:type="spellEnd"/>
+      <w:r>
+        <w:rPr>
+          <w:rFonts w:ascii="Arial" w:hAnsi="Arial" w:cs="Arial"/>
+          <w:i/>
+        </w:rPr>
+        <w:t xml:space="preserve"> Politik- und </w:t>
+      </w:r>
+      <w:proofErr w:type="spellStart"/>
+      <w:r>
+        <w:rPr>
+          <w:rFonts w:ascii="Arial" w:hAnsi="Arial" w:cs="Arial"/>
+          <w:i/>
+        </w:rPr>
+        <w:t>Sozialwissenschaft</w:t>
+      </w:r>
+      <w:proofErr w:type="spellEnd"/>
       <w:r>
         <w:rPr>
           <w:rFonts w:ascii="Arial" w:hAnsi="Arial" w:cs="Arial"/>
@@ -4522,15 +5184,7 @@
           <w:rFonts w:ascii="Arial" w:hAnsi="Arial" w:cs="Arial"/>
           <w:i/>
         </w:rPr>
-        <w:t xml:space="preserve">Policy-making Processes and the European Constitution: A </w:t>
-      </w:r>
-      <w:r>
-        <w:rPr>
-          <w:rFonts w:ascii="Arial" w:hAnsi="Arial" w:cs="Arial"/>
-          <w:i/>
-        </w:rPr>
-        <w:lastRenderedPageBreak/>
-        <w:t>comparative study of member states and accession countries</w:t>
+        <w:t>Policy-making Processes and the European Constitution: A comparative study of member states and accession countries</w:t>
       </w:r>
       <w:r>
         <w:rPr>
@@ -4564,13 +5218,29 @@
         </w:rPr>
         <w:t xml:space="preserve">2005. Benoit, Kenneth. </w:t>
       </w:r>
-      <w:hyperlink r:id="rId79" w:history="1">
+      <w:hyperlink r:id="rId80" w:history="1">
         <w:r>
           <w:rPr>
             <w:rStyle w:val="Hyperlink"/>
             <w:rFonts w:ascii="Arial" w:hAnsi="Arial" w:cs="Arial"/>
           </w:rPr>
-          <w:t>“Hungary: Holding Back the Tiers.”</w:t>
+          <w:t xml:space="preserve">“Hungary: Holding Back the </w:t>
+        </w:r>
+        <w:proofErr w:type="spellStart"/>
+        <w:r>
+          <w:rPr>
+            <w:rStyle w:val="Hyperlink"/>
+            <w:rFonts w:ascii="Arial" w:hAnsi="Arial" w:cs="Arial"/>
+          </w:rPr>
+          <w:t>Tiers</w:t>
+        </w:r>
+        <w:proofErr w:type="spellEnd"/>
+        <w:r>
+          <w:rPr>
+            <w:rStyle w:val="Hyperlink"/>
+            <w:rFonts w:ascii="Arial" w:hAnsi="Arial" w:cs="Arial"/>
+          </w:rPr>
+          <w:t>.”</w:t>
         </w:r>
       </w:hyperlink>
       <w:r>
@@ -4606,7 +5276,7 @@
         </w:rPr>
         <w:t xml:space="preserve">2004. Benoit, Kenneth, Michael Laver and Daniela Giannetti. </w:t>
       </w:r>
-      <w:hyperlink r:id="rId80" w:history="1">
+      <w:hyperlink r:id="rId81" w:history="1">
         <w:r>
           <w:rPr>
             <w:rStyle w:val="Hyperlink"/>
@@ -4675,7 +5345,7 @@
         </w:rPr>
         <w:t xml:space="preserve">1999. Benoit, Kenneth. </w:t>
       </w:r>
-      <w:hyperlink r:id="rId81" w:history="1">
+      <w:hyperlink r:id="rId82" w:history="1">
         <w:r>
           <w:rPr>
             <w:rStyle w:val="Hyperlink"/>
@@ -4824,7 +5494,14 @@
         <w:rPr>
           <w:rFonts w:ascii="Arial" w:hAnsi="Arial" w:cs="Arial"/>
         </w:rPr>
-        <w:t>[in Hungarian]. Budapest: Demokr</w:t>
+        <w:t xml:space="preserve">[in Hungarian]. Budapest: </w:t>
+      </w:r>
+      <w:proofErr w:type="spellStart"/>
+      <w:r>
+        <w:rPr>
+          <w:rFonts w:ascii="Arial" w:hAnsi="Arial" w:cs="Arial"/>
+        </w:rPr>
+        <w:t>Demokr</w:t>
       </w:r>
       <w:r>
         <w:rPr>
@@ -4836,7 +5513,21 @@
         <w:rPr>
           <w:rFonts w:ascii="Arial" w:hAnsi="Arial" w:cs="Arial"/>
         </w:rPr>
-        <w:t>cia Kutat</w:t>
+        <w:t>cia</w:t>
+      </w:r>
+      <w:proofErr w:type="spellEnd"/>
+      <w:r>
+        <w:rPr>
+          <w:rFonts w:ascii="Arial" w:hAnsi="Arial" w:cs="Arial"/>
+        </w:rPr>
+        <w:t xml:space="preserve"> </w:t>
+      </w:r>
+      <w:proofErr w:type="spellStart"/>
+      <w:r>
+        <w:rPr>
+          <w:rFonts w:ascii="Arial" w:hAnsi="Arial" w:cs="Arial"/>
+        </w:rPr>
+        <w:t>Kutat</w:t>
       </w:r>
       <w:r>
         <w:rPr>
@@ -4848,7 +5539,21 @@
         <w:rPr>
           <w:rFonts w:ascii="Arial" w:hAnsi="Arial" w:cs="Arial"/>
         </w:rPr>
-        <w:t>sok Magyar K</w:t>
+        <w:t>sok</w:t>
+      </w:r>
+      <w:proofErr w:type="spellEnd"/>
+      <w:r>
+        <w:rPr>
+          <w:rFonts w:ascii="Arial" w:hAnsi="Arial" w:cs="Arial"/>
+        </w:rPr>
+        <w:t xml:space="preserve"> Magyar </w:t>
+      </w:r>
+      <w:proofErr w:type="spellStart"/>
+      <w:r>
+        <w:rPr>
+          <w:rFonts w:ascii="Arial" w:hAnsi="Arial" w:cs="Arial"/>
+        </w:rPr>
+        <w:t>K</w:t>
       </w:r>
       <w:r>
         <w:rPr>
@@ -4860,7 +5565,21 @@
         <w:rPr>
           <w:rFonts w:ascii="Arial" w:hAnsi="Arial" w:cs="Arial"/>
         </w:rPr>
-        <w:t>zpontja Alap</w:t>
+        <w:t>zpontja</w:t>
+      </w:r>
+      <w:proofErr w:type="spellEnd"/>
+      <w:r>
+        <w:rPr>
+          <w:rFonts w:ascii="Arial" w:hAnsi="Arial" w:cs="Arial"/>
+        </w:rPr>
+        <w:t xml:space="preserve"> </w:t>
+      </w:r>
+      <w:proofErr w:type="spellStart"/>
+      <w:r>
+        <w:rPr>
+          <w:rFonts w:ascii="Arial" w:hAnsi="Arial" w:cs="Arial"/>
+        </w:rPr>
+        <w:t>Alap</w:t>
       </w:r>
       <w:r>
         <w:rPr>
@@ -4884,7 +5603,14 @@
         <w:rPr>
           <w:rFonts w:ascii="Arial" w:hAnsi="Arial" w:cs="Arial"/>
         </w:rPr>
-        <w:t>ny.</w:t>
+        <w:t>ny</w:t>
+      </w:r>
+      <w:proofErr w:type="spellEnd"/>
+      <w:r>
+        <w:rPr>
+          <w:rFonts w:ascii="Arial" w:hAnsi="Arial" w:cs="Arial"/>
+        </w:rPr>
+        <w:t>.</w:t>
       </w:r>
     </w:p>
     <w:p>
@@ -4901,7 +5627,7 @@
         </w:rPr>
         <w:t>1995. Benoit, Kenneth and Kenneth Shepsle. “</w:t>
       </w:r>
-      <w:hyperlink r:id="rId82" w:history="1">
+      <w:hyperlink r:id="rId83" w:history="1">
         <w:r>
           <w:rPr>
             <w:rStyle w:val="Hyperlink"/>
@@ -4965,14 +5691,23 @@
         </w:rPr>
         <w:t>Ruler, Mollie and Kenneth Benoit. “</w:t>
       </w:r>
-      <w:hyperlink r:id="rId83" w:history="1">
+      <w:hyperlink r:id="rId84" w:history="1">
         <w:r>
           <w:rPr>
             <w:rStyle w:val="Hyperlink"/>
             <w:rFonts w:ascii="Arial" w:hAnsi="Arial" w:cs="Arial"/>
           </w:rPr>
-          <w:t>Application of LLMs to Qualitative Coding Tasks Using quallmer</w:t>
+          <w:t xml:space="preserve">Application of LLMs to Qualitative Coding Tasks Using </w:t>
         </w:r>
+        <w:proofErr w:type="spellStart"/>
+        <w:r>
+          <w:rPr>
+            <w:rStyle w:val="Hyperlink"/>
+            <w:rFonts w:ascii="Arial" w:hAnsi="Arial" w:cs="Arial"/>
+          </w:rPr>
+          <w:t>quallmer</w:t>
+        </w:r>
+        <w:proofErr w:type="spellEnd"/>
       </w:hyperlink>
       <w:r>
         <w:rPr>
@@ -5027,7 +5762,7 @@
         </w:rPr>
         <w:t xml:space="preserve"> 75(4): 453-454. </w:t>
       </w:r>
-      <w:hyperlink r:id="rId84" w:history="1">
+      <w:hyperlink r:id="rId85" w:history="1">
         <w:r>
           <w:rPr>
             <w:rStyle w:val="Hyperlink"/>
@@ -5049,7 +5784,21 @@
         <w:rPr>
           <w:rFonts w:ascii="Arial" w:hAnsi="Arial" w:cs="Arial"/>
         </w:rPr>
-        <w:t xml:space="preserve">2006. Benoit, Kenneth and Michael Laver. “Automated Content Analysis of Political Texts using Wordscores.” </w:t>
+        <w:t xml:space="preserve">2006. Benoit, Kenneth and Michael Laver. “Automated Content Analysis of Political Texts using </w:t>
+      </w:r>
+      <w:proofErr w:type="spellStart"/>
+      <w:r>
+        <w:rPr>
+          <w:rFonts w:ascii="Arial" w:hAnsi="Arial" w:cs="Arial"/>
+        </w:rPr>
+        <w:t>Wordscores</w:t>
+      </w:r>
+      <w:proofErr w:type="spellEnd"/>
+      <w:r>
+        <w:rPr>
+          <w:rFonts w:ascii="Arial" w:hAnsi="Arial" w:cs="Arial"/>
+        </w:rPr>
+        <w:t xml:space="preserve">.” </w:t>
       </w:r>
       <w:r>
         <w:rPr>
@@ -5079,7 +5828,7 @@
         </w:rPr>
         <w:t xml:space="preserve">2005. </w:t>
       </w:r>
-      <w:hyperlink r:id="rId85" w:history="1">
+      <w:hyperlink r:id="rId86" w:history="1">
         <w:r>
           <w:rPr>
             <w:rStyle w:val="Hyperlink"/>
@@ -5122,12 +5871,37 @@
         </w:rPr>
         <w:t xml:space="preserve">2002. “Hungary.” In Sara Pendergast and Thomas Pendergast, eds. </w:t>
       </w:r>
-      <w:r>
-        <w:rPr>
-          <w:rFonts w:ascii="Arial" w:hAnsi="Arial" w:cs="Arial"/>
-          <w:i/>
-        </w:rPr>
-        <w:t>Worldmark Encyclopedia of National Economies</w:t>
+      <w:proofErr w:type="spellStart"/>
+      <w:r>
+        <w:rPr>
+          <w:rFonts w:ascii="Arial" w:hAnsi="Arial" w:cs="Arial"/>
+          <w:i/>
+        </w:rPr>
+        <w:t>Worldmark</w:t>
+      </w:r>
+      <w:proofErr w:type="spellEnd"/>
+      <w:r>
+        <w:rPr>
+          <w:rFonts w:ascii="Arial" w:hAnsi="Arial" w:cs="Arial"/>
+          <w:i/>
+        </w:rPr>
+        <w:t xml:space="preserve"> </w:t>
+      </w:r>
+      <w:proofErr w:type="spellStart"/>
+      <w:r>
+        <w:rPr>
+          <w:rFonts w:ascii="Arial" w:hAnsi="Arial" w:cs="Arial"/>
+          <w:i/>
+        </w:rPr>
+        <w:t>Encyclopedia</w:t>
+      </w:r>
+      <w:proofErr w:type="spellEnd"/>
+      <w:r>
+        <w:rPr>
+          <w:rFonts w:ascii="Arial" w:hAnsi="Arial" w:cs="Arial"/>
+          <w:i/>
+        </w:rPr>
+        <w:t xml:space="preserve"> of National Economies</w:t>
       </w:r>
       <w:r>
         <w:rPr>
@@ -5148,9 +5922,10 @@
         <w:rPr>
           <w:rFonts w:ascii="Arial" w:hAnsi="Arial" w:cs="Arial"/>
         </w:rPr>
+        <w:lastRenderedPageBreak/>
         <w:t xml:space="preserve">2001. </w:t>
       </w:r>
-      <w:hyperlink r:id="rId86" w:history="1">
+      <w:hyperlink r:id="rId87" w:history="1">
         <w:r>
           <w:rPr>
             <w:rStyle w:val="Hyperlink"/>
@@ -5193,7 +5968,7 @@
         </w:rPr>
         <w:t xml:space="preserve">2001. Review of </w:t>
       </w:r>
-      <w:hyperlink r:id="rId87" w:history="1">
+      <w:hyperlink r:id="rId88" w:history="1">
         <w:r>
           <w:rPr>
             <w:rStyle w:val="Hyperlink"/>
@@ -5221,7 +5996,23 @@
           <w:rFonts w:ascii="Arial" w:hAnsi="Arial" w:cs="Arial"/>
           <w:i/>
         </w:rPr>
-        <w:t xml:space="preserve">Acta Politica: International Journal of Political Science </w:t>
+        <w:t xml:space="preserve">Acta </w:t>
+      </w:r>
+      <w:proofErr w:type="spellStart"/>
+      <w:r>
+        <w:rPr>
+          <w:rFonts w:ascii="Arial" w:hAnsi="Arial" w:cs="Arial"/>
+          <w:i/>
+        </w:rPr>
+        <w:t>Politica</w:t>
+      </w:r>
+      <w:proofErr w:type="spellEnd"/>
+      <w:r>
+        <w:rPr>
+          <w:rFonts w:ascii="Arial" w:hAnsi="Arial" w:cs="Arial"/>
+          <w:i/>
+        </w:rPr>
+        <w:t xml:space="preserve">: International Journal of Political Science </w:t>
       </w:r>
       <w:r>
         <w:rPr>
@@ -5272,6 +6063,7 @@
         </w:rPr>
         <w:t xml:space="preserve">1997. Benoit, Kenneth. “Forecasting the 1998 [Hungarian] Parliamentary Elections.” [In Hungarian] </w:t>
       </w:r>
+      <w:proofErr w:type="spellStart"/>
       <w:r>
         <w:rPr>
           <w:rFonts w:ascii="Arial" w:hAnsi="Arial" w:cs="Arial"/>
@@ -5305,7 +6097,15 @@
           <w:rFonts w:ascii="Arial" w:hAnsi="Arial" w:cs="Arial"/>
           <w:i/>
         </w:rPr>
-        <w:t xml:space="preserve">g </w:t>
+        <w:t>g</w:t>
+      </w:r>
+      <w:proofErr w:type="spellEnd"/>
+      <w:r>
+        <w:rPr>
+          <w:rFonts w:ascii="Arial" w:hAnsi="Arial" w:cs="Arial"/>
+          <w:i/>
+        </w:rPr>
+        <w:t xml:space="preserve"> </w:t>
       </w:r>
       <w:r>
         <w:rPr>
@@ -5328,7 +6128,7 @@
         </w:rPr>
         <w:t xml:space="preserve">1997. </w:t>
       </w:r>
-      <w:hyperlink r:id="rId88" w:history="1">
+      <w:hyperlink r:id="rId89" w:history="1">
         <w:r>
           <w:rPr>
             <w:rStyle w:val="Hyperlink"/>
@@ -5370,7 +6170,6 @@
         <w:rPr>
           <w:rFonts w:ascii="Arial" w:hAnsi="Arial" w:cs="Arial"/>
         </w:rPr>
-        <w:lastRenderedPageBreak/>
         <w:t>Working Papers</w:t>
       </w:r>
     </w:p>
@@ -5387,7 +6186,7 @@
         </w:rPr>
         <w:t xml:space="preserve">2017. Perry, Patrick and Kenneth Benoit. “Scaling Text with the Class Affinity Model.” London School of Economics and New York University manuscript. </w:t>
       </w:r>
-      <w:hyperlink r:id="rId100" w:history="1">
+      <w:hyperlink r:id="rId90" w:history="1">
         <w:r>
           <w:rPr>
             <w:rStyle w:val="Hyperlink"/>
@@ -5400,7 +6199,7 @@
         <w:rPr>
           <w:rFonts w:ascii="Arial" w:hAnsi="Arial" w:cs="Arial"/>
         </w:rPr>
-        <w:t xml:space="preserve">.</w:t>
+        <w:t>.</w:t>
       </w:r>
     </w:p>
     <w:p>
@@ -5428,7 +6227,7 @@
         </w:rPr>
         <w:t xml:space="preserve">, Kenneth Benoit, and Michael Laver. </w:t>
       </w:r>
-      <w:hyperlink r:id="rId89" w:history="1">
+      <w:hyperlink r:id="rId91" w:history="1">
         <w:r>
           <w:rPr>
             <w:rStyle w:val="Hyperlink"/>
@@ -5443,17 +6242,32 @@
         </w:rPr>
         <w:t xml:space="preserve"> Working paper 2004/17, Real Instituto Elcano de </w:t>
       </w:r>
-      <w:r>
-        <w:rPr>
-          <w:rFonts w:ascii="Arial" w:hAnsi="Arial" w:cs="Arial"/>
-        </w:rPr>
-        <w:t>Estudios Internacionales</w:t>
-      </w:r>
-      <w:r>
-        <w:rPr>
-          <w:rFonts w:ascii="Arial" w:hAnsi="Arial" w:cs="Arial"/>
-        </w:rPr>
-        <w:t xml:space="preserve"> y Estrat</w:t>
+      <w:proofErr w:type="spellStart"/>
+      <w:r>
+        <w:rPr>
+          <w:rFonts w:ascii="Arial" w:hAnsi="Arial" w:cs="Arial"/>
+        </w:rPr>
+        <w:t>Estudios</w:t>
+      </w:r>
+      <w:proofErr w:type="spellEnd"/>
+      <w:r>
+        <w:rPr>
+          <w:rFonts w:ascii="Arial" w:hAnsi="Arial" w:cs="Arial"/>
+        </w:rPr>
+        <w:t xml:space="preserve"> Internacionales</w:t>
+      </w:r>
+      <w:r>
+        <w:rPr>
+          <w:rFonts w:ascii="Arial" w:hAnsi="Arial" w:cs="Arial"/>
+        </w:rPr>
+        <w:t xml:space="preserve"> y </w:t>
+      </w:r>
+      <w:proofErr w:type="spellStart"/>
+      <w:r>
+        <w:rPr>
+          <w:rFonts w:ascii="Arial" w:hAnsi="Arial" w:cs="Arial"/>
+        </w:rPr>
+        <w:t>Estrat</w:t>
       </w:r>
       <w:r>
         <w:rPr>
@@ -5465,7 +6279,14 @@
         <w:rPr>
           <w:rFonts w:ascii="Arial" w:hAnsi="Arial" w:cs="Arial"/>
         </w:rPr>
-        <w:t>gicos (Madrid, July 18).</w:t>
+        <w:t>gicos</w:t>
+      </w:r>
+      <w:proofErr w:type="spellEnd"/>
+      <w:r>
+        <w:rPr>
+          <w:rFonts w:ascii="Arial" w:hAnsi="Arial" w:cs="Arial"/>
+        </w:rPr>
+        <w:t xml:space="preserve"> (Madrid, July 18).</w:t>
       </w:r>
     </w:p>
     <w:p>
@@ -5488,12 +6309,21 @@
         </w:rPr>
         <w:t xml:space="preserve"> </w:t>
       </w:r>
-      <w:r>
-        <w:rPr>
-          <w:rFonts w:ascii="Arial" w:hAnsi="Arial" w:cs="Arial"/>
-          <w:i/>
-        </w:rPr>
-        <w:t>Center for International Affairs Working Paper No. 97–5</w:t>
+      <w:proofErr w:type="spellStart"/>
+      <w:r>
+        <w:rPr>
+          <w:rFonts w:ascii="Arial" w:hAnsi="Arial" w:cs="Arial"/>
+          <w:i/>
+        </w:rPr>
+        <w:t>Center</w:t>
+      </w:r>
+      <w:proofErr w:type="spellEnd"/>
+      <w:r>
+        <w:rPr>
+          <w:rFonts w:ascii="Arial" w:hAnsi="Arial" w:cs="Arial"/>
+          <w:i/>
+        </w:rPr>
+        <w:t xml:space="preserve"> for International Affairs Working Paper No. 97–5</w:t>
       </w:r>
       <w:r>
         <w:rPr>
@@ -5515,12 +6345,21 @@
         </w:rPr>
         <w:t xml:space="preserve">1994. “Re-examining Regime Type and War Involvement.” </w:t>
       </w:r>
-      <w:r>
-        <w:rPr>
-          <w:rFonts w:ascii="Arial" w:hAnsi="Arial" w:cs="Arial"/>
-          <w:i/>
-        </w:rPr>
-        <w:t>Center for International Affairs Working Paper No. 94–5</w:t>
+      <w:proofErr w:type="spellStart"/>
+      <w:r>
+        <w:rPr>
+          <w:rFonts w:ascii="Arial" w:hAnsi="Arial" w:cs="Arial"/>
+          <w:i/>
+        </w:rPr>
+        <w:t>Center</w:t>
+      </w:r>
+      <w:proofErr w:type="spellEnd"/>
+      <w:r>
+        <w:rPr>
+          <w:rFonts w:ascii="Arial" w:hAnsi="Arial" w:cs="Arial"/>
+          <w:i/>
+        </w:rPr>
+        <w:t xml:space="preserve"> for International Affairs Working Paper No. 94–5</w:t>
       </w:r>
       <w:r>
         <w:rPr>
@@ -5532,14 +6371,9 @@
     <w:p>
       <w:pPr>
         <w:pStyle w:val="Heading1"/>
-        <w:rPr>
-          <w:rFonts w:ascii="Arial" w:hAnsi="Arial" w:cs="Arial"/>
-        </w:rPr>
-      </w:pPr>
-      <w:r>
-        <w:rPr>
-          <w:rFonts w:ascii="Arial" w:hAnsi="Arial" w:cs="Arial"/>
-        </w:rPr>
+        <w:spacing w:before="280"/>
+      </w:pPr>
+      <w:r>
         <w:t>Professional Service</w:t>
       </w:r>
     </w:p>
@@ -5790,6 +6624,7 @@
         <w:rPr>
           <w:rFonts w:ascii="Arial" w:hAnsi="Arial" w:cs="Arial"/>
         </w:rPr>
+        <w:lastRenderedPageBreak/>
         <w:t>Head of Department, Department of Methodology, 2011–2013; 2015–2018.</w:t>
       </w:r>
     </w:p>
@@ -6072,7 +6907,6 @@
           <w:rFonts w:ascii="Arial" w:hAnsi="Arial" w:cs="Arial"/>
           <w:i/>
         </w:rPr>
-        <w:lastRenderedPageBreak/>
         <w:t>Editorial board</w:t>
       </w:r>
       <w:r>
@@ -6715,7 +7549,7 @@
     </w:p>
     <w:p>
       <w:pPr>
-        <w:spacing w:after="575"/>
+        <w:spacing w:after="495"/>
         <w:ind w:left="11" w:right="591" w:firstLine="0"/>
         <w:rPr>
           <w:rFonts w:ascii="Arial" w:hAnsi="Arial" w:cs="Arial"/>
@@ -6731,14 +7565,8 @@
     <w:p>
       <w:pPr>
         <w:pStyle w:val="Heading1"/>
-        <w:rPr>
-          <w:rFonts w:ascii="Arial" w:hAnsi="Arial" w:cs="Arial"/>
-        </w:rPr>
-      </w:pPr>
-      <w:r>
-        <w:rPr>
-          <w:rFonts w:ascii="Arial" w:hAnsi="Arial" w:cs="Arial"/>
-        </w:rPr>
+      </w:pPr>
+      <w:r>
         <w:t>Teaching</w:t>
       </w:r>
     </w:p>
@@ -6943,7 +7771,7 @@
     </w:p>
     <w:p>
       <w:pPr>
-        <w:spacing w:after="580"/>
+        <w:spacing w:after="500"/>
         <w:ind w:left="11" w:right="591" w:firstLine="0"/>
         <w:rPr>
           <w:rFonts w:ascii="Arial" w:hAnsi="Arial" w:cs="Arial"/>
@@ -6998,14 +7826,8 @@
     <w:p>
       <w:pPr>
         <w:pStyle w:val="Heading1"/>
-        <w:rPr>
-          <w:rFonts w:ascii="Arial" w:hAnsi="Arial" w:cs="Arial"/>
-        </w:rPr>
-      </w:pPr>
-      <w:r>
-        <w:rPr>
-          <w:rFonts w:ascii="Arial" w:hAnsi="Arial" w:cs="Arial"/>
-        </w:rPr>
+      </w:pPr>
+      <w:r>
         <w:lastRenderedPageBreak/>
         <w:t>Grants</w:t>
       </w:r>
@@ -7022,13 +7844,13 @@
           <w:rFonts w:ascii="Arial" w:hAnsi="Arial" w:cs="Arial"/>
           <w:b/>
         </w:rPr>
-        <w:t xml:space="preserve">MOE Academic Research Fund Tier 3</w:t>
-      </w:r>
-      <w:r>
-        <w:rPr>
-          <w:rFonts w:ascii="Arial" w:hAnsi="Arial" w:cs="Arial"/>
-        </w:rPr>
-        <w:t xml:space="preserve">, Singapore Ministry of Education, for “The Curation of Blue Zone 3.0 – Examining Societal Nudges to Promote Well-being of a Super-aged Population” (MOET32025-0006), 2026–2031. S$10,212,410 total. Co-Principal Investigator.</w:t>
+        <w:t>MOE Academic Research Fund Tier 3</w:t>
+      </w:r>
+      <w:r>
+        <w:rPr>
+          <w:rFonts w:ascii="Arial" w:hAnsi="Arial" w:cs="Arial"/>
+        </w:rPr>
+        <w:t>, Singapore Ministry of Education, for “The Curation of Blue Zone 3.0 – Examining Societal Nudges to Promote Well-being of a Super-aged Population” (MOET32025-0006), 2026–2031. S$10,212,410 total. Co-Principal Investigator.</w:t>
       </w:r>
     </w:p>
     <w:p>
@@ -7043,13 +7865,13 @@
           <w:rFonts w:ascii="Arial" w:hAnsi="Arial" w:cs="Arial"/>
           <w:b/>
         </w:rPr>
-        <w:t xml:space="preserve">MOE 2025 Special Programmatic Grant</w:t>
-      </w:r>
-      <w:r>
-        <w:rPr>
-          <w:rFonts w:ascii="Arial" w:hAnsi="Arial" w:cs="Arial"/>
-        </w:rPr>
-        <w:t xml:space="preserve">, Singapore Ministry of Education, for “Computational Social Simulations for Aiding Policy Design” (SSRC2025-SPG-001), 2026–2031. S$1,727,392 total. Co-Principal Investigator.</w:t>
+        <w:t>MOE 2025 Special Programmatic Grant</w:t>
+      </w:r>
+      <w:r>
+        <w:rPr>
+          <w:rFonts w:ascii="Arial" w:hAnsi="Arial" w:cs="Arial"/>
+        </w:rPr>
+        <w:t>, Singapore Ministry of Education, for “Computational Social Simulations for Aiding Policy Design” (SSRC2025-SPG-001), 2026–2031. S$1,727,392 total. Co-Principal Investigator.</w:t>
       </w:r>
     </w:p>
     <w:p>
@@ -7064,13 +7886,13 @@
           <w:rFonts w:ascii="Arial" w:hAnsi="Arial" w:cs="Arial"/>
           <w:b/>
         </w:rPr>
-        <w:t xml:space="preserve">ARC Discovery Project</w:t>
-      </w:r>
-      <w:r>
-        <w:rPr>
-          <w:rFonts w:ascii="Arial" w:hAnsi="Arial" w:cs="Arial"/>
-        </w:rPr>
-        <w:t xml:space="preserve">, Australian Research Council, for “AI analysis of deliberation quality in Australian Parliament debates”, 2024–2026. AUD 370,230 total. Partner Investigator.</w:t>
+        <w:t>ARC Discovery Project</w:t>
+      </w:r>
+      <w:r>
+        <w:rPr>
+          <w:rFonts w:ascii="Arial" w:hAnsi="Arial" w:cs="Arial"/>
+        </w:rPr>
+        <w:t>, Australian Research Council, for “AI analysis of deliberation quality in Australian Parliament debates”, 2024–2026. AUD 370,230 total. Partner Investigator.</w:t>
       </w:r>
     </w:p>
     <w:p>
@@ -7372,7 +8194,21 @@
         <w:rPr>
           <w:rFonts w:ascii="Arial" w:hAnsi="Arial" w:cs="Arial"/>
         </w:rPr>
-        <w:t xml:space="preserve">97,695 for the Trinity Collegebased team on the project </w:t>
+        <w:t xml:space="preserve">97,695 for the Trinity </w:t>
+      </w:r>
+      <w:proofErr w:type="spellStart"/>
+      <w:r>
+        <w:rPr>
+          <w:rFonts w:ascii="Arial" w:hAnsi="Arial" w:cs="Arial"/>
+        </w:rPr>
+        <w:t>Collegebased</w:t>
+      </w:r>
+      <w:proofErr w:type="spellEnd"/>
+      <w:r>
+        <w:rPr>
+          <w:rFonts w:ascii="Arial" w:hAnsi="Arial" w:cs="Arial"/>
+        </w:rPr>
+        <w:t xml:space="preserve"> team on the project </w:t>
       </w:r>
       <w:r>
         <w:rPr>
@@ -7451,14 +8287,9 @@
     <w:p>
       <w:pPr>
         <w:pStyle w:val="Heading1"/>
-        <w:rPr>
-          <w:rFonts w:ascii="Arial" w:hAnsi="Arial" w:cs="Arial"/>
-        </w:rPr>
-      </w:pPr>
-      <w:r>
-        <w:rPr>
-          <w:rFonts w:ascii="Arial" w:hAnsi="Arial" w:cs="Arial"/>
-        </w:rPr>
+        <w:spacing w:before="280"/>
+      </w:pPr>
+      <w:r>
         <w:t>Awards</w:t>
       </w:r>
     </w:p>
@@ -7481,7 +8312,36 @@
         <w:rPr>
           <w:rFonts w:ascii="Arial" w:hAnsi="Arial" w:cs="Arial"/>
         </w:rPr>
-        <w:t xml:space="preserve">(with Kohei Watanabe, Haiyan Wang, Paul Nulty, Adam Obeng, Stefan Müller, and Akitaka Matsuo). From the Society for Political Methodology, for quanteda. The Best Statistical Software Award recognizes individuals for developing statistical software that makes a significant research contribution.</w:t>
+        <w:t xml:space="preserve">(with Kohei Watanabe, Haiyan Wang, Paul Nulty, Adam Obeng, Stefan Müller, and </w:t>
+      </w:r>
+      <w:proofErr w:type="spellStart"/>
+      <w:r>
+        <w:rPr>
+          <w:rFonts w:ascii="Arial" w:hAnsi="Arial" w:cs="Arial"/>
+        </w:rPr>
+        <w:t>Akitaka</w:t>
+      </w:r>
+      <w:proofErr w:type="spellEnd"/>
+      <w:r>
+        <w:rPr>
+          <w:rFonts w:ascii="Arial" w:hAnsi="Arial" w:cs="Arial"/>
+        </w:rPr>
+        <w:t xml:space="preserve"> Matsuo). From the Society for Political Methodology, for </w:t>
+      </w:r>
+      <w:proofErr w:type="spellStart"/>
+      <w:r>
+        <w:rPr>
+          <w:rFonts w:ascii="Arial" w:hAnsi="Arial" w:cs="Arial"/>
+        </w:rPr>
+        <w:lastRenderedPageBreak/>
+        <w:t>quanteda</w:t>
+      </w:r>
+      <w:proofErr w:type="spellEnd"/>
+      <w:r>
+        <w:rPr>
+          <w:rFonts w:ascii="Arial" w:hAnsi="Arial" w:cs="Arial"/>
+        </w:rPr>
+        <w:t>. The Best Statistical Software Award recognizes individuals for developing statistical software that makes a significant research contribution.</w:t>
       </w:r>
     </w:p>
     <w:p>
@@ -7568,7 +8428,7 @@
     </w:p>
     <w:p>
       <w:pPr>
-        <w:spacing w:after="571"/>
+        <w:spacing w:after="491"/>
         <w:ind w:left="11" w:right="591" w:firstLine="0"/>
         <w:rPr>
           <w:rFonts w:ascii="Arial" w:hAnsi="Arial" w:cs="Arial"/>
@@ -7587,12 +8447,21 @@
         </w:rPr>
         <w:t xml:space="preserve">Presented by the Computers and Multimedia Section at the 1998 annual meeting. For </w:t>
       </w:r>
-      <w:r>
-        <w:rPr>
-          <w:rFonts w:ascii="Arial" w:hAnsi="Arial" w:cs="Arial"/>
-          <w:i/>
-        </w:rPr>
-        <w:t>EzI: A(n Easy) Program for Ecological Inference</w:t>
+      <w:proofErr w:type="spellStart"/>
+      <w:r>
+        <w:rPr>
+          <w:rFonts w:ascii="Arial" w:hAnsi="Arial" w:cs="Arial"/>
+          <w:i/>
+        </w:rPr>
+        <w:t>EzI</w:t>
+      </w:r>
+      <w:proofErr w:type="spellEnd"/>
+      <w:r>
+        <w:rPr>
+          <w:rFonts w:ascii="Arial" w:hAnsi="Arial" w:cs="Arial"/>
+          <w:i/>
+        </w:rPr>
+        <w:t>: A(n Easy) Program for Ecological Inference</w:t>
       </w:r>
       <w:r>
         <w:rPr>
@@ -7604,14 +8473,8 @@
     <w:p>
       <w:pPr>
         <w:pStyle w:val="Heading1"/>
-        <w:rPr>
-          <w:rFonts w:ascii="Arial" w:hAnsi="Arial" w:cs="Arial"/>
-        </w:rPr>
-      </w:pPr>
-      <w:r>
-        <w:rPr>
-          <w:rFonts w:ascii="Arial" w:hAnsi="Arial" w:cs="Arial"/>
-        </w:rPr>
+      </w:pPr>
+      <w:r>
         <w:t>Language Skills</w:t>
       </w:r>
     </w:p>
@@ -7670,7 +8533,7 @@
         </w:rPr>
         <w:t xml:space="preserve">This C.V. is online at </w:t>
       </w:r>
-      <w:hyperlink r:id="rId90" w:history="1">
+      <w:hyperlink r:id="rId92" w:history="1">
         <w:r>
           <w:rPr>
             <w:rStyle w:val="Hyperlink"/>
@@ -7689,12 +8552,12 @@
       </w:r>
     </w:p>
     <w:sectPr>
-      <w:headerReference w:type="even" r:id="rId91"/>
-      <w:headerReference w:type="default" r:id="rId92"/>
-      <w:footerReference w:type="even" r:id="rId93"/>
-      <w:footerReference w:type="default" r:id="rId94"/>
-      <w:headerReference w:type="first" r:id="rId95"/>
-      <w:footerReference w:type="first" r:id="rId96"/>
+      <w:headerReference w:type="even" r:id="rId93"/>
+      <w:headerReference w:type="default" r:id="rId94"/>
+      <w:footerReference w:type="even" r:id="rId95"/>
+      <w:footerReference w:type="default" r:id="rId96"/>
+      <w:headerReference w:type="first" r:id="rId97"/>
+      <w:footerReference w:type="first" r:id="rId98"/>
       <w:pgSz w:w="11906" w:h="16838"/>
       <w:pgMar w:top="1440" w:right="834" w:bottom="1631" w:left="1440" w:header="720" w:footer="720" w:gutter="0"/>
       <w:cols w:space="720"/>
@@ -7764,14 +8627,14 @@
       <w:ind w:left="0" w:right="606" w:firstLine="0"/>
       <w:jc w:val="center"/>
       <w:rPr>
-        <w:rFonts w:ascii="Times New Roman" w:hAnsi="Times New Roman" w:cs="Times New Roman"/>
+        <w:rFonts w:ascii="Arial" w:hAnsi="Arial" w:cs="Arial"/>
         <w:sz w:val="20"/>
         <w:szCs w:val="20"/>
       </w:rPr>
     </w:pPr>
     <w:r>
       <w:rPr>
-        <w:rFonts w:ascii="Times New Roman" w:hAnsi="Times New Roman" w:cs="Times New Roman"/>
+        <w:rFonts w:ascii="Arial" w:hAnsi="Arial" w:cs="Arial"/>
         <w:sz w:val="20"/>
         <w:szCs w:val="20"/>
       </w:rPr>
@@ -7779,7 +8642,7 @@
     </w:r>
     <w:r>
       <w:rPr>
-        <w:rFonts w:ascii="Times New Roman" w:hAnsi="Times New Roman" w:cs="Times New Roman"/>
+        <w:rFonts w:ascii="Arial" w:hAnsi="Arial" w:cs="Arial"/>
         <w:sz w:val="20"/>
         <w:szCs w:val="20"/>
       </w:rPr>
@@ -7787,7 +8650,7 @@
     </w:r>
     <w:r>
       <w:rPr>
-        <w:rFonts w:ascii="Times New Roman" w:hAnsi="Times New Roman" w:cs="Times New Roman"/>
+        <w:rFonts w:ascii="Arial" w:hAnsi="Arial" w:cs="Arial"/>
         <w:sz w:val="20"/>
         <w:szCs w:val="20"/>
       </w:rPr>
@@ -7795,7 +8658,7 @@
     </w:r>
     <w:r>
       <w:rPr>
-        <w:rFonts w:ascii="Times New Roman" w:hAnsi="Times New Roman" w:cs="Times New Roman"/>
+        <w:rFonts w:ascii="Arial" w:hAnsi="Arial" w:cs="Arial"/>
         <w:sz w:val="20"/>
         <w:szCs w:val="20"/>
       </w:rPr>
@@ -7803,7 +8666,7 @@
     </w:r>
     <w:r>
       <w:rPr>
-        <w:rFonts w:ascii="Times New Roman" w:hAnsi="Times New Roman" w:cs="Times New Roman"/>
+        <w:rFonts w:ascii="Arial" w:hAnsi="Arial" w:cs="Arial"/>
         <w:sz w:val="20"/>
         <w:szCs w:val="20"/>
       </w:rPr>
@@ -9152,17 +10015,17 @@
     <w:link w:val="Heading1Char"/>
     <w:uiPriority w:val="9"/>
     <w:qFormat/>
-    <w:rsid w:val="006D725F"/>
+    <w:rsid w:val="00AD7B55"/>
     <w:pPr>
       <w:keepNext/>
       <w:keepLines/>
-      <w:spacing w:before="480" w:after="240" w:line="240" w:lineRule="auto"/>
-      <w:ind w:right="560"/>
+      <w:spacing w:before="360" w:after="240" w:line="240" w:lineRule="auto"/>
+      <w:ind w:right="561"/>
       <w:jc w:val="center"/>
       <w:outlineLvl w:val="0"/>
     </w:pPr>
     <w:rPr>
-      <w:rFonts w:ascii="Times New Roman" w:eastAsia="Cambria" w:hAnsi="Times New Roman" w:cs="Times New Roman"/>
+      <w:rFonts w:ascii="Arial" w:eastAsia="Cambria" w:hAnsi="Arial" w:cs="Arial"/>
       <w:b/>
       <w:color w:val="000000"/>
     </w:rPr>
@@ -9229,9 +10092,9 @@
     <w:name w:val="Heading 1 Char"/>
     <w:link w:val="Heading1"/>
     <w:uiPriority w:val="9"/>
-    <w:rsid w:val="006D725F"/>
+    <w:rsid w:val="00AD7B55"/>
     <w:rPr>
-      <w:rFonts w:ascii="Times New Roman" w:eastAsia="Cambria" w:hAnsi="Times New Roman" w:cs="Times New Roman"/>
+      <w:rFonts w:ascii="Arial" w:eastAsia="Cambria" w:hAnsi="Arial" w:cs="Arial"/>
       <w:b/>
       <w:color w:val="000000"/>
     </w:rPr>
@@ -9670,6 +10533,45 @@
 </a:theme>
 </file>
 
+<file path=word/webextensions/taskpanes.xml><?xml version="1.0" encoding="utf-8"?>
+<wetp:taskpanes xmlns:wetp="http://schemas.microsoft.com/office/webextensions/taskpanes/2010/11">
+  <wetp:taskpane dockstate="right" visibility="0" width="350" row="0">
+    <wetp:webextensionref xmlns:r="http://schemas.openxmlformats.org/officeDocument/2006/relationships" r:id="rId1"/>
+  </wetp:taskpane>
+  <wetp:taskpane dockstate="right" visibility="0" width="350" row="0">
+    <wetp:webextensionref xmlns:r="http://schemas.openxmlformats.org/officeDocument/2006/relationships" r:id="rId2"/>
+  </wetp:taskpane>
+</wetp:taskpanes>
+</file>
+
+<file path=word/webextensions/webextension1.xml><?xml version="1.0" encoding="utf-8"?>
+<we:webextension xmlns:we="http://schemas.microsoft.com/office/webextensions/webextension/2010/11" id="{5CC959C9-B054-6B4A-92BF-EFDE90E4D252}">
+  <we:reference id="WA200010453" version="1.0.0.1" store="Omex" storeType="OMEX"/>
+  <we:alternateReferences>
+    <we:reference id="WA200010453" version="1.0.0.1" store="WA200010453" storeType="OMEX"/>
+  </we:alternateReferences>
+  <we:properties>
+    <we:property name="claude.fileId" value="&quot;c33c855a-5f74-44e7-8f04-8e0071f36b39&quot;"/>
+  </we:properties>
+  <we:bindings/>
+  <we:snapshot xmlns:r="http://schemas.openxmlformats.org/officeDocument/2006/relationships"/>
+</we:webextension>
+</file>
+
+<file path=word/webextensions/webextension2.xml><?xml version="1.0" encoding="utf-8"?>
+<we:webextension xmlns:we="http://schemas.microsoft.com/office/webextensions/webextension/2010/11" id="{BF3FF5E6-59F8-C94B-865C-06C1B4A03236}">
+  <we:reference id="WA200010215" version="2.0.0.1" store="Omex" storeType="OMEX"/>
+  <we:alternateReferences>
+    <we:reference id="WA200010215" version="2.0.0.1" store="WA200010215" storeType="OMEX"/>
+  </we:alternateReferences>
+  <we:properties>
+    <we:property name="bps.codex_control.document_id" value="&quot;25b324a1-8100-449f-8065-1fd2415cadbe&quot;"/>
+  </we:properties>
+  <we:bindings/>
+  <we:snapshot xmlns:r="http://schemas.openxmlformats.org/officeDocument/2006/relationships"/>
+</we:webextension>
+</file>
+
 <file path=docMetadata/LabelInfo.xml><?xml version="1.0" encoding="utf-8"?>
 <clbl:labelList xmlns:clbl="http://schemas.microsoft.com/office/2020/mipLabelMetadata">
   <clbl:label id="{1e756f9c-e3e7-4810-90da-ea6bfb97c434}" enabled="1" method="Privileged" siteId="{c98a79ca-5a9a-4791-a243-f06afd67464d}" contentBits="0" removed="0"/>

</xml_diff>